<commit_message>
fix(docx): restore conversion fidelity
</commit_message>
<xml_diff>
--- a/generated_master.docx
+++ b/generated_master.docx
@@ -2805,7 +2805,7 @@
       <w:r>
         <w:fldChar w:fldCharType="separate"/>
       </w:r>
-      <w:hyperlink w:anchor="_Toc234697843" w:history="1">
+      <w:hyperlink w:anchor="_Toc234806220" w:history="1">
         <w:r>
           <w:rPr>
             <w:rStyle w:val="ac"/>
@@ -2870,7 +2870,7 @@
             <w:noProof/>
             <w:webHidden/>
           </w:rPr>
-          <w:instrText>PAGEREF _Toc234697843 \h</w:instrText>
+          <w:instrText>PAGEREF _Toc234806220 \h</w:instrText>
         </w:r>
         <w:r>
           <w:rPr>
@@ -2927,7 +2927,7 @@
           <w14:ligatures w14:val="standardContextual"/>
         </w:rPr>
       </w:pPr>
-      <w:hyperlink w:anchor="_Toc234697844" w:history="1">
+      <w:hyperlink w:anchor="_Toc234806221" w:history="1">
         <w:r>
           <w:rPr>
             <w:rStyle w:val="ac"/>
@@ -2971,7 +2971,7 @@
             <w:noProof/>
             <w:webHidden/>
           </w:rPr>
-          <w:instrText>PAGEREF _Toc234697844 \h</w:instrText>
+          <w:instrText>PAGEREF _Toc234806221 \h</w:instrText>
         </w:r>
         <w:r>
           <w:rPr>
@@ -3028,7 +3028,7 @@
           <w14:ligatures w14:val="standardContextual"/>
         </w:rPr>
       </w:pPr>
-      <w:hyperlink w:anchor="_Toc234697845" w:history="1">
+      <w:hyperlink w:anchor="_Toc234806222" w:history="1">
         <w:r>
           <w:rPr>
             <w:rStyle w:val="ac"/>
@@ -3072,7 +3072,7 @@
             <w:noProof/>
             <w:webHidden/>
           </w:rPr>
-          <w:instrText>PAGEREF _Toc234697845 \h</w:instrText>
+          <w:instrText>PAGEREF _Toc234806222 \h</w:instrText>
         </w:r>
         <w:r>
           <w:rPr>
@@ -3129,7 +3129,7 @@
           <w14:ligatures w14:val="standardContextual"/>
         </w:rPr>
       </w:pPr>
-      <w:hyperlink w:anchor="_Toc234697846" w:history="1">
+      <w:hyperlink w:anchor="_Toc234806223" w:history="1">
         <w:r>
           <w:rPr>
             <w:rStyle w:val="ac"/>
@@ -3173,7 +3173,7 @@
             <w:noProof/>
             <w:webHidden/>
           </w:rPr>
-          <w:instrText>PAGEREF _Toc234697846 \h</w:instrText>
+          <w:instrText>PAGEREF _Toc234806223 \h</w:instrText>
         </w:r>
         <w:r>
           <w:rPr>
@@ -3230,7 +3230,7 @@
           <w14:ligatures w14:val="standardContextual"/>
         </w:rPr>
       </w:pPr>
-      <w:hyperlink w:anchor="_Toc234697847" w:history="1">
+      <w:hyperlink w:anchor="_Toc234806224" w:history="1">
         <w:r>
           <w:rPr>
             <w:rStyle w:val="ac"/>
@@ -3274,7 +3274,7 @@
             <w:noProof/>
             <w:webHidden/>
           </w:rPr>
-          <w:instrText>PAGEREF _Toc234697847 \h</w:instrText>
+          <w:instrText>PAGEREF _Toc234806224 \h</w:instrText>
         </w:r>
         <w:r>
           <w:rPr>
@@ -3331,7 +3331,7 @@
           <w14:ligatures w14:val="standardContextual"/>
         </w:rPr>
       </w:pPr>
-      <w:hyperlink w:anchor="_Toc234697848" w:history="1">
+      <w:hyperlink w:anchor="_Toc234806225" w:history="1">
         <w:r>
           <w:rPr>
             <w:rStyle w:val="ac"/>
@@ -3375,7 +3375,7 @@
             <w:noProof/>
             <w:webHidden/>
           </w:rPr>
-          <w:instrText>PAGEREF _Toc234697848 \h</w:instrText>
+          <w:instrText>PAGEREF _Toc234806225 \h</w:instrText>
         </w:r>
         <w:r>
           <w:rPr>
@@ -3432,7 +3432,7 @@
           <w14:ligatures w14:val="standardContextual"/>
         </w:rPr>
       </w:pPr>
-      <w:hyperlink w:anchor="_Toc234697849" w:history="1">
+      <w:hyperlink w:anchor="_Toc234806226" w:history="1">
         <w:r>
           <w:rPr>
             <w:rStyle w:val="ac"/>
@@ -3476,7 +3476,7 @@
             <w:noProof/>
             <w:webHidden/>
           </w:rPr>
-          <w:instrText>PAGEREF _Toc234697849 \h</w:instrText>
+          <w:instrText>PAGEREF _Toc234806226 \h</w:instrText>
         </w:r>
         <w:r>
           <w:rPr>
@@ -3533,7 +3533,7 @@
           <w14:ligatures w14:val="standardContextual"/>
         </w:rPr>
       </w:pPr>
-      <w:hyperlink w:anchor="_Toc234697850" w:history="1">
+      <w:hyperlink w:anchor="_Toc234806227" w:history="1">
         <w:r>
           <w:rPr>
             <w:rStyle w:val="ac"/>
@@ -3577,7 +3577,7 @@
             <w:noProof/>
             <w:webHidden/>
           </w:rPr>
-          <w:instrText>PAGEREF _Toc234697850 \h</w:instrText>
+          <w:instrText>PAGEREF _Toc234806227 \h</w:instrText>
         </w:r>
         <w:r>
           <w:rPr>
@@ -3634,7 +3634,7 @@
           <w14:ligatures w14:val="standardContextual"/>
         </w:rPr>
       </w:pPr>
-      <w:hyperlink w:anchor="_Toc234697851" w:history="1">
+      <w:hyperlink w:anchor="_Toc234806228" w:history="1">
         <w:r>
           <w:rPr>
             <w:rStyle w:val="ac"/>
@@ -3699,7 +3699,7 @@
             <w:noProof/>
             <w:webHidden/>
           </w:rPr>
-          <w:instrText>PAGEREF _Toc234697851 \h</w:instrText>
+          <w:instrText>PAGEREF _Toc234806228 \h</w:instrText>
         </w:r>
         <w:r>
           <w:rPr>
@@ -3756,7 +3756,7 @@
           <w14:ligatures w14:val="standardContextual"/>
         </w:rPr>
       </w:pPr>
-      <w:hyperlink w:anchor="_Toc234697852" w:history="1">
+      <w:hyperlink w:anchor="_Toc234806229" w:history="1">
         <w:r>
           <w:rPr>
             <w:rStyle w:val="ac"/>
@@ -3800,7 +3800,7 @@
             <w:noProof/>
             <w:webHidden/>
           </w:rPr>
-          <w:instrText>PAGEREF _Toc234697852 \h</w:instrText>
+          <w:instrText>PAGEREF _Toc234806229 \h</w:instrText>
         </w:r>
         <w:r>
           <w:rPr>
@@ -3857,7 +3857,7 @@
           <w14:ligatures w14:val="standardContextual"/>
         </w:rPr>
       </w:pPr>
-      <w:hyperlink w:anchor="_Toc234697853" w:history="1">
+      <w:hyperlink w:anchor="_Toc234806230" w:history="1">
         <w:r>
           <w:rPr>
             <w:rStyle w:val="ac"/>
@@ -3901,7 +3901,7 @@
             <w:noProof/>
             <w:webHidden/>
           </w:rPr>
-          <w:instrText>PAGEREF _Toc234697853 \h</w:instrText>
+          <w:instrText>PAGEREF _Toc234806230 \h</w:instrText>
         </w:r>
         <w:r>
           <w:rPr>
@@ -3958,7 +3958,7 @@
           <w14:ligatures w14:val="standardContextual"/>
         </w:rPr>
       </w:pPr>
-      <w:hyperlink w:anchor="_Toc234697854" w:history="1">
+      <w:hyperlink w:anchor="_Toc234806231" w:history="1">
         <w:r>
           <w:rPr>
             <w:rStyle w:val="ac"/>
@@ -4002,7 +4002,7 @@
             <w:noProof/>
             <w:webHidden/>
           </w:rPr>
-          <w:instrText>PAGEREF _Toc234697854 \h</w:instrText>
+          <w:instrText>PAGEREF _Toc234806231 \h</w:instrText>
         </w:r>
         <w:r>
           <w:rPr>
@@ -4059,7 +4059,7 @@
           <w14:ligatures w14:val="standardContextual"/>
         </w:rPr>
       </w:pPr>
-      <w:hyperlink w:anchor="_Toc234697855" w:history="1">
+      <w:hyperlink w:anchor="_Toc234806232" w:history="1">
         <w:r>
           <w:rPr>
             <w:rStyle w:val="ac"/>
@@ -4138,7 +4138,7 @@
             <w:noProof/>
             <w:webHidden/>
           </w:rPr>
-          <w:instrText>PAGEREF _Toc234697855 \h</w:instrText>
+          <w:instrText>PAGEREF _Toc234806232 \h</w:instrText>
         </w:r>
         <w:r>
           <w:rPr>
@@ -4195,7 +4195,7 @@
           <w14:ligatures w14:val="standardContextual"/>
         </w:rPr>
       </w:pPr>
-      <w:hyperlink w:anchor="_Toc234697856" w:history="1">
+      <w:hyperlink w:anchor="_Toc234806233" w:history="1">
         <w:r>
           <w:rPr>
             <w:rStyle w:val="ac"/>
@@ -4239,7 +4239,7 @@
             <w:noProof/>
             <w:webHidden/>
           </w:rPr>
-          <w:instrText>PAGEREF _Toc234697856 \h</w:instrText>
+          <w:instrText>PAGEREF _Toc234806233 \h</w:instrText>
         </w:r>
         <w:r>
           <w:rPr>
@@ -4296,7 +4296,7 @@
           <w14:ligatures w14:val="standardContextual"/>
         </w:rPr>
       </w:pPr>
-      <w:hyperlink w:anchor="_Toc234697857" w:history="1">
+      <w:hyperlink w:anchor="_Toc234806234" w:history="1">
         <w:r>
           <w:rPr>
             <w:rStyle w:val="ac"/>
@@ -4340,7 +4340,7 @@
             <w:noProof/>
             <w:webHidden/>
           </w:rPr>
-          <w:instrText>PAGEREF _Toc234697857 \h</w:instrText>
+          <w:instrText>PAGEREF _Toc234806234 \h</w:instrText>
         </w:r>
         <w:r>
           <w:rPr>
@@ -4397,7 +4397,7 @@
           <w14:ligatures w14:val="standardContextual"/>
         </w:rPr>
       </w:pPr>
-      <w:hyperlink w:anchor="_Toc234697858" w:history="1">
+      <w:hyperlink w:anchor="_Toc234806235" w:history="1">
         <w:r>
           <w:rPr>
             <w:rStyle w:val="ac"/>
@@ -4441,7 +4441,7 @@
             <w:noProof/>
             <w:webHidden/>
           </w:rPr>
-          <w:instrText>PAGEREF _Toc234697858 \h</w:instrText>
+          <w:instrText>PAGEREF _Toc234806235 \h</w:instrText>
         </w:r>
         <w:r>
           <w:rPr>
@@ -4498,7 +4498,7 @@
           <w14:ligatures w14:val="standardContextual"/>
         </w:rPr>
       </w:pPr>
-      <w:hyperlink w:anchor="_Toc234697859" w:history="1">
+      <w:hyperlink w:anchor="_Toc234806236" w:history="1">
         <w:r>
           <w:rPr>
             <w:rStyle w:val="ac"/>
@@ -4542,7 +4542,7 @@
             <w:noProof/>
             <w:webHidden/>
           </w:rPr>
-          <w:instrText>PAGEREF _Toc234697859 \h</w:instrText>
+          <w:instrText>PAGEREF _Toc234806236 \h</w:instrText>
         </w:r>
         <w:r>
           <w:rPr>
@@ -4599,7 +4599,7 @@
           <w14:ligatures w14:val="standardContextual"/>
         </w:rPr>
       </w:pPr>
-      <w:hyperlink w:anchor="_Toc234697860" w:history="1">
+      <w:hyperlink w:anchor="_Toc234806237" w:history="1">
         <w:r>
           <w:rPr>
             <w:rStyle w:val="ac"/>
@@ -4643,7 +4643,7 @@
             <w:noProof/>
             <w:webHidden/>
           </w:rPr>
-          <w:instrText>PAGEREF _Toc234697860 \h</w:instrText>
+          <w:instrText>PAGEREF _Toc234806237 \h</w:instrText>
         </w:r>
         <w:r>
           <w:rPr>
@@ -4700,7 +4700,7 @@
           <w14:ligatures w14:val="standardContextual"/>
         </w:rPr>
       </w:pPr>
-      <w:hyperlink w:anchor="_Toc234697861" w:history="1">
+      <w:hyperlink w:anchor="_Toc234806238" w:history="1">
         <w:r>
           <w:rPr>
             <w:rStyle w:val="ac"/>
@@ -4744,7 +4744,7 @@
             <w:noProof/>
             <w:webHidden/>
           </w:rPr>
-          <w:instrText>PAGEREF _Toc234697861 \h</w:instrText>
+          <w:instrText>PAGEREF _Toc234806238 \h</w:instrText>
         </w:r>
         <w:r>
           <w:rPr>
@@ -4801,7 +4801,7 @@
           <w14:ligatures w14:val="standardContextual"/>
         </w:rPr>
       </w:pPr>
-      <w:hyperlink w:anchor="_Toc234697862" w:history="1">
+      <w:hyperlink w:anchor="_Toc234806239" w:history="1">
         <w:r>
           <w:rPr>
             <w:rStyle w:val="ac"/>
@@ -4866,7 +4866,7 @@
             <w:noProof/>
             <w:webHidden/>
           </w:rPr>
-          <w:instrText>PAGEREF _Toc234697862 \h</w:instrText>
+          <w:instrText>PAGEREF _Toc234806239 \h</w:instrText>
         </w:r>
         <w:r>
           <w:rPr>
@@ -4923,7 +4923,7 @@
           <w14:ligatures w14:val="standardContextual"/>
         </w:rPr>
       </w:pPr>
-      <w:hyperlink w:anchor="_Toc234697863" w:history="1">
+      <w:hyperlink w:anchor="_Toc234806240" w:history="1">
         <w:r>
           <w:rPr>
             <w:rStyle w:val="ac"/>
@@ -4967,7 +4967,7 @@
             <w:noProof/>
             <w:webHidden/>
           </w:rPr>
-          <w:instrText>PAGEREF _Toc234697863 \h</w:instrText>
+          <w:instrText>PAGEREF _Toc234806240 \h</w:instrText>
         </w:r>
         <w:r>
           <w:rPr>
@@ -5024,7 +5024,7 @@
           <w14:ligatures w14:val="standardContextual"/>
         </w:rPr>
       </w:pPr>
-      <w:hyperlink w:anchor="_Toc234697864" w:history="1">
+      <w:hyperlink w:anchor="_Toc234806241" w:history="1">
         <w:r>
           <w:rPr>
             <w:rStyle w:val="ac"/>
@@ -5068,7 +5068,7 @@
             <w:noProof/>
             <w:webHidden/>
           </w:rPr>
-          <w:instrText>PAGEREF _Toc234697864 \h</w:instrText>
+          <w:instrText>PAGEREF _Toc234806241 \h</w:instrText>
         </w:r>
         <w:r>
           <w:rPr>
@@ -5125,7 +5125,7 @@
           <w14:ligatures w14:val="standardContextual"/>
         </w:rPr>
       </w:pPr>
-      <w:hyperlink w:anchor="_Toc234697865" w:history="1">
+      <w:hyperlink w:anchor="_Toc234806242" w:history="1">
         <w:r>
           <w:rPr>
             <w:rStyle w:val="ac"/>
@@ -5169,7 +5169,7 @@
             <w:noProof/>
             <w:webHidden/>
           </w:rPr>
-          <w:instrText>PAGEREF _Toc234697865 \h</w:instrText>
+          <w:instrText>PAGEREF _Toc234806242 \h</w:instrText>
         </w:r>
         <w:r>
           <w:rPr>
@@ -5226,7 +5226,7 @@
           <w14:ligatures w14:val="standardContextual"/>
         </w:rPr>
       </w:pPr>
-      <w:hyperlink w:anchor="_Toc234697866" w:history="1">
+      <w:hyperlink w:anchor="_Toc234806243" w:history="1">
         <w:r>
           <w:rPr>
             <w:rStyle w:val="ac"/>
@@ -5270,7 +5270,7 @@
             <w:noProof/>
             <w:webHidden/>
           </w:rPr>
-          <w:instrText>PAGEREF _Toc234697866 \h</w:instrText>
+          <w:instrText>PAGEREF _Toc234806243 \h</w:instrText>
         </w:r>
         <w:r>
           <w:rPr>
@@ -5327,7 +5327,7 @@
           <w14:ligatures w14:val="standardContextual"/>
         </w:rPr>
       </w:pPr>
-      <w:hyperlink w:anchor="_Toc234697867" w:history="1">
+      <w:hyperlink w:anchor="_Toc234806244" w:history="1">
         <w:r>
           <w:rPr>
             <w:rStyle w:val="ac"/>
@@ -5371,7 +5371,7 @@
             <w:noProof/>
             <w:webHidden/>
           </w:rPr>
-          <w:instrText>PAGEREF _Toc234697867 \h</w:instrText>
+          <w:instrText>PAGEREF _Toc234806244 \h</w:instrText>
         </w:r>
         <w:r>
           <w:rPr>
@@ -5428,7 +5428,7 @@
           <w14:ligatures w14:val="standardContextual"/>
         </w:rPr>
       </w:pPr>
-      <w:hyperlink w:anchor="_Toc234697868" w:history="1">
+      <w:hyperlink w:anchor="_Toc234806245" w:history="1">
         <w:r>
           <w:rPr>
             <w:rStyle w:val="ac"/>
@@ -5472,7 +5472,7 @@
             <w:noProof/>
             <w:webHidden/>
           </w:rPr>
-          <w:instrText>PAGEREF _Toc234697868 \h</w:instrText>
+          <w:instrText>PAGEREF _Toc234806245 \h</w:instrText>
         </w:r>
         <w:r>
           <w:rPr>
@@ -5529,7 +5529,7 @@
           <w14:ligatures w14:val="standardContextual"/>
         </w:rPr>
       </w:pPr>
-      <w:hyperlink w:anchor="_Toc234697869" w:history="1">
+      <w:hyperlink w:anchor="_Toc234806246" w:history="1">
         <w:r>
           <w:rPr>
             <w:rStyle w:val="ac"/>
@@ -5573,7 +5573,7 @@
             <w:noProof/>
             <w:webHidden/>
           </w:rPr>
-          <w:instrText>PAGEREF _Toc234697869 \h</w:instrText>
+          <w:instrText>PAGEREF _Toc234806246 \h</w:instrText>
         </w:r>
         <w:r>
           <w:rPr>
@@ -5630,7 +5630,7 @@
           <w14:ligatures w14:val="standardContextual"/>
         </w:rPr>
       </w:pPr>
-      <w:hyperlink w:anchor="_Toc234697870" w:history="1">
+      <w:hyperlink w:anchor="_Toc234806247" w:history="1">
         <w:r>
           <w:rPr>
             <w:rStyle w:val="ac"/>
@@ -5674,7 +5674,7 @@
             <w:noProof/>
             <w:webHidden/>
           </w:rPr>
-          <w:instrText>PAGEREF _Toc234697870 \h</w:instrText>
+          <w:instrText>PAGEREF _Toc234806247 \h</w:instrText>
         </w:r>
         <w:r>
           <w:rPr>
@@ -5731,7 +5731,7 @@
           <w14:ligatures w14:val="standardContextual"/>
         </w:rPr>
       </w:pPr>
-      <w:hyperlink w:anchor="_Toc234697871" w:history="1">
+      <w:hyperlink w:anchor="_Toc234806248" w:history="1">
         <w:r>
           <w:rPr>
             <w:rStyle w:val="ac"/>
@@ -5775,7 +5775,7 @@
             <w:noProof/>
             <w:webHidden/>
           </w:rPr>
-          <w:instrText>PAGEREF _Toc234697871 \h</w:instrText>
+          <w:instrText>PAGEREF _Toc234806248 \h</w:instrText>
         </w:r>
         <w:r>
           <w:rPr>
@@ -5832,7 +5832,7 @@
           <w14:ligatures w14:val="standardContextual"/>
         </w:rPr>
       </w:pPr>
-      <w:hyperlink w:anchor="_Toc234697872" w:history="1">
+      <w:hyperlink w:anchor="_Toc234806249" w:history="1">
         <w:r>
           <w:rPr>
             <w:rStyle w:val="ac"/>
@@ -5876,7 +5876,7 @@
             <w:noProof/>
             <w:webHidden/>
           </w:rPr>
-          <w:instrText>PAGEREF _Toc234697872 \h</w:instrText>
+          <w:instrText>PAGEREF _Toc234806249 \h</w:instrText>
         </w:r>
         <w:r>
           <w:rPr>
@@ -5933,7 +5933,7 @@
           <w14:ligatures w14:val="standardContextual"/>
         </w:rPr>
       </w:pPr>
-      <w:hyperlink w:anchor="_Toc234697873" w:history="1">
+      <w:hyperlink w:anchor="_Toc234806250" w:history="1">
         <w:r>
           <w:rPr>
             <w:rStyle w:val="ac"/>
@@ -5998,7 +5998,7 @@
             <w:noProof/>
             <w:webHidden/>
           </w:rPr>
-          <w:instrText>PAGEREF _Toc234697873 \h</w:instrText>
+          <w:instrText>PAGEREF _Toc234806250 \h</w:instrText>
         </w:r>
         <w:r>
           <w:rPr>
@@ -6055,7 +6055,7 @@
           <w14:ligatures w14:val="standardContextual"/>
         </w:rPr>
       </w:pPr>
-      <w:hyperlink w:anchor="_Toc234697874" w:history="1">
+      <w:hyperlink w:anchor="_Toc234806251" w:history="1">
         <w:r>
           <w:rPr>
             <w:rStyle w:val="ac"/>
@@ -6099,7 +6099,7 @@
             <w:noProof/>
             <w:webHidden/>
           </w:rPr>
-          <w:instrText>PAGEREF _Toc234697874 \h</w:instrText>
+          <w:instrText>PAGEREF _Toc234806251 \h</w:instrText>
         </w:r>
         <w:r>
           <w:rPr>
@@ -6156,7 +6156,7 @@
           <w14:ligatures w14:val="standardContextual"/>
         </w:rPr>
       </w:pPr>
-      <w:hyperlink w:anchor="_Toc234697875" w:history="1">
+      <w:hyperlink w:anchor="_Toc234806252" w:history="1">
         <w:r>
           <w:rPr>
             <w:rStyle w:val="ac"/>
@@ -6200,7 +6200,7 @@
             <w:noProof/>
             <w:webHidden/>
           </w:rPr>
-          <w:instrText>PAGEREF _Toc234697875 \h</w:instrText>
+          <w:instrText>PAGEREF _Toc234806252 \h</w:instrText>
         </w:r>
         <w:r>
           <w:rPr>
@@ -6257,7 +6257,7 @@
           <w14:ligatures w14:val="standardContextual"/>
         </w:rPr>
       </w:pPr>
-      <w:hyperlink w:anchor="_Toc234697876" w:history="1">
+      <w:hyperlink w:anchor="_Toc234806253" w:history="1">
         <w:r>
           <w:rPr>
             <w:rStyle w:val="ac"/>
@@ -6301,7 +6301,7 @@
             <w:noProof/>
             <w:webHidden/>
           </w:rPr>
-          <w:instrText>PAGEREF _Toc234697876 \h</w:instrText>
+          <w:instrText>PAGEREF _Toc234806253 \h</w:instrText>
         </w:r>
         <w:r>
           <w:rPr>
@@ -6358,7 +6358,7 @@
           <w14:ligatures w14:val="standardContextual"/>
         </w:rPr>
       </w:pPr>
-      <w:hyperlink w:anchor="_Toc234697877" w:history="1">
+      <w:hyperlink w:anchor="_Toc234806254" w:history="1">
         <w:r>
           <w:rPr>
             <w:rStyle w:val="ac"/>
@@ -6402,7 +6402,7 @@
             <w:noProof/>
             <w:webHidden/>
           </w:rPr>
-          <w:instrText>PAGEREF _Toc234697877 \h</w:instrText>
+          <w:instrText>PAGEREF _Toc234806254 \h</w:instrText>
         </w:r>
         <w:r>
           <w:rPr>
@@ -6459,7 +6459,7 @@
           <w14:ligatures w14:val="standardContextual"/>
         </w:rPr>
       </w:pPr>
-      <w:hyperlink w:anchor="_Toc234697878" w:history="1">
+      <w:hyperlink w:anchor="_Toc234806255" w:history="1">
         <w:r>
           <w:rPr>
             <w:rStyle w:val="ac"/>
@@ -6503,7 +6503,7 @@
             <w:noProof/>
             <w:webHidden/>
           </w:rPr>
-          <w:instrText>PAGEREF _Toc234697878 \h</w:instrText>
+          <w:instrText>PAGEREF _Toc234806255 \h</w:instrText>
         </w:r>
         <w:r>
           <w:rPr>
@@ -6560,7 +6560,7 @@
           <w14:ligatures w14:val="standardContextual"/>
         </w:rPr>
       </w:pPr>
-      <w:hyperlink w:anchor="_Toc234697879" w:history="1">
+      <w:hyperlink w:anchor="_Toc234806256" w:history="1">
         <w:r>
           <w:rPr>
             <w:rStyle w:val="ac"/>
@@ -6604,7 +6604,7 @@
             <w:noProof/>
             <w:webHidden/>
           </w:rPr>
-          <w:instrText>PAGEREF _Toc234697879 \h</w:instrText>
+          <w:instrText>PAGEREF _Toc234806256 \h</w:instrText>
         </w:r>
         <w:r>
           <w:rPr>
@@ -6661,7 +6661,7 @@
           <w14:ligatures w14:val="standardContextual"/>
         </w:rPr>
       </w:pPr>
-      <w:hyperlink w:anchor="_Toc234697880" w:history="1">
+      <w:hyperlink w:anchor="_Toc234806257" w:history="1">
         <w:r>
           <w:rPr>
             <w:rStyle w:val="ac"/>
@@ -6705,7 +6705,7 @@
             <w:noProof/>
             <w:webHidden/>
           </w:rPr>
-          <w:instrText>PAGEREF _Toc234697880 \h</w:instrText>
+          <w:instrText>PAGEREF _Toc234806257 \h</w:instrText>
         </w:r>
         <w:r>
           <w:rPr>
@@ -6762,7 +6762,7 @@
           <w14:ligatures w14:val="standardContextual"/>
         </w:rPr>
       </w:pPr>
-      <w:hyperlink w:anchor="_Toc234697881" w:history="1">
+      <w:hyperlink w:anchor="_Toc234806258" w:history="1">
         <w:r>
           <w:rPr>
             <w:rStyle w:val="ac"/>
@@ -6806,7 +6806,7 @@
             <w:noProof/>
             <w:webHidden/>
           </w:rPr>
-          <w:instrText>PAGEREF _Toc234697881 \h</w:instrText>
+          <w:instrText>PAGEREF _Toc234806258 \h</w:instrText>
         </w:r>
         <w:r>
           <w:rPr>
@@ -6863,7 +6863,7 @@
           <w14:ligatures w14:val="standardContextual"/>
         </w:rPr>
       </w:pPr>
-      <w:hyperlink w:anchor="_Toc234697882" w:history="1">
+      <w:hyperlink w:anchor="_Toc234806259" w:history="1">
         <w:r>
           <w:rPr>
             <w:rStyle w:val="ac"/>
@@ -6907,7 +6907,7 @@
             <w:noProof/>
             <w:webHidden/>
           </w:rPr>
-          <w:instrText>PAGEREF _Toc234697882 \h</w:instrText>
+          <w:instrText>PAGEREF _Toc234806259 \h</w:instrText>
         </w:r>
         <w:r>
           <w:rPr>
@@ -6964,7 +6964,7 @@
           <w14:ligatures w14:val="standardContextual"/>
         </w:rPr>
       </w:pPr>
-      <w:hyperlink w:anchor="_Toc234697883" w:history="1">
+      <w:hyperlink w:anchor="_Toc234806260" w:history="1">
         <w:r>
           <w:rPr>
             <w:rStyle w:val="ac"/>
@@ -7008,7 +7008,7 @@
             <w:noProof/>
             <w:webHidden/>
           </w:rPr>
-          <w:instrText>PAGEREF _Toc234697883 \h</w:instrText>
+          <w:instrText>PAGEREF _Toc234806260 \h</w:instrText>
         </w:r>
         <w:r>
           <w:rPr>
@@ -7065,7 +7065,7 @@
           <w14:ligatures w14:val="standardContextual"/>
         </w:rPr>
       </w:pPr>
-      <w:hyperlink w:anchor="_Toc234697884" w:history="1">
+      <w:hyperlink w:anchor="_Toc234806261" w:history="1">
         <w:r>
           <w:rPr>
             <w:rStyle w:val="ac"/>
@@ -7109,7 +7109,7 @@
             <w:noProof/>
             <w:webHidden/>
           </w:rPr>
-          <w:instrText>PAGEREF _Toc234697884 \h</w:instrText>
+          <w:instrText>PAGEREF _Toc234806261 \h</w:instrText>
         </w:r>
         <w:r>
           <w:rPr>
@@ -7166,7 +7166,7 @@
           <w14:ligatures w14:val="standardContextual"/>
         </w:rPr>
       </w:pPr>
-      <w:hyperlink w:anchor="_Toc234697885" w:history="1">
+      <w:hyperlink w:anchor="_Toc234806262" w:history="1">
         <w:r>
           <w:rPr>
             <w:rStyle w:val="ac"/>
@@ -7210,7 +7210,7 @@
             <w:noProof/>
             <w:webHidden/>
           </w:rPr>
-          <w:instrText>PAGEREF _Toc234697885 \h</w:instrText>
+          <w:instrText>PAGEREF _Toc234806262 \h</w:instrText>
         </w:r>
         <w:r>
           <w:rPr>
@@ -7267,7 +7267,7 @@
           <w14:ligatures w14:val="standardContextual"/>
         </w:rPr>
       </w:pPr>
-      <w:hyperlink w:anchor="_Toc234697886" w:history="1">
+      <w:hyperlink w:anchor="_Toc234806263" w:history="1">
         <w:r>
           <w:rPr>
             <w:rStyle w:val="ac"/>
@@ -7332,7 +7332,7 @@
             <w:noProof/>
             <w:webHidden/>
           </w:rPr>
-          <w:instrText>PAGEREF _Toc234697886 \h</w:instrText>
+          <w:instrText>PAGEREF _Toc234806263 \h</w:instrText>
         </w:r>
         <w:r>
           <w:rPr>
@@ -7389,7 +7389,7 @@
           <w14:ligatures w14:val="standardContextual"/>
         </w:rPr>
       </w:pPr>
-      <w:hyperlink w:anchor="_Toc234697887" w:history="1">
+      <w:hyperlink w:anchor="_Toc234806264" w:history="1">
         <w:r>
           <w:rPr>
             <w:rStyle w:val="ac"/>
@@ -7433,7 +7433,7 @@
             <w:noProof/>
             <w:webHidden/>
           </w:rPr>
-          <w:instrText>PAGEREF _Toc234697887 \h</w:instrText>
+          <w:instrText>PAGEREF _Toc234806264 \h</w:instrText>
         </w:r>
         <w:r>
           <w:rPr>
@@ -7490,7 +7490,7 @@
           <w14:ligatures w14:val="standardContextual"/>
         </w:rPr>
       </w:pPr>
-      <w:hyperlink w:anchor="_Toc234697888" w:history="1">
+      <w:hyperlink w:anchor="_Toc234806265" w:history="1">
         <w:r>
           <w:rPr>
             <w:rStyle w:val="ac"/>
@@ -7534,7 +7534,7 @@
             <w:noProof/>
             <w:webHidden/>
           </w:rPr>
-          <w:instrText>PAGEREF _Toc234697888 \h</w:instrText>
+          <w:instrText>PAGEREF _Toc234806265 \h</w:instrText>
         </w:r>
         <w:r>
           <w:rPr>
@@ -7591,7 +7591,7 @@
           <w14:ligatures w14:val="standardContextual"/>
         </w:rPr>
       </w:pPr>
-      <w:hyperlink w:anchor="_Toc234697889" w:history="1">
+      <w:hyperlink w:anchor="_Toc234806266" w:history="1">
         <w:r>
           <w:rPr>
             <w:rStyle w:val="ac"/>
@@ -7635,7 +7635,7 @@
             <w:noProof/>
             <w:webHidden/>
           </w:rPr>
-          <w:instrText>PAGEREF _Toc234697889 \h</w:instrText>
+          <w:instrText>PAGEREF _Toc234806266 \h</w:instrText>
         </w:r>
         <w:r>
           <w:rPr>
@@ -7692,7 +7692,7 @@
           <w14:ligatures w14:val="standardContextual"/>
         </w:rPr>
       </w:pPr>
-      <w:hyperlink w:anchor="_Toc234697890" w:history="1">
+      <w:hyperlink w:anchor="_Toc234806267" w:history="1">
         <w:r>
           <w:rPr>
             <w:rStyle w:val="ac"/>
@@ -7736,7 +7736,7 @@
             <w:noProof/>
             <w:webHidden/>
           </w:rPr>
-          <w:instrText>PAGEREF _Toc234697890 \h</w:instrText>
+          <w:instrText>PAGEREF _Toc234806267 \h</w:instrText>
         </w:r>
         <w:r>
           <w:rPr>
@@ -7793,7 +7793,7 @@
           <w14:ligatures w14:val="standardContextual"/>
         </w:rPr>
       </w:pPr>
-      <w:hyperlink w:anchor="_Toc234697891" w:history="1">
+      <w:hyperlink w:anchor="_Toc234806268" w:history="1">
         <w:r>
           <w:rPr>
             <w:rStyle w:val="ac"/>
@@ -7837,7 +7837,7 @@
             <w:noProof/>
             <w:webHidden/>
           </w:rPr>
-          <w:instrText>PAGEREF _Toc234697891 \h</w:instrText>
+          <w:instrText>PAGEREF _Toc234806268 \h</w:instrText>
         </w:r>
         <w:r>
           <w:rPr>
@@ -7894,7 +7894,7 @@
           <w14:ligatures w14:val="standardContextual"/>
         </w:rPr>
       </w:pPr>
-      <w:hyperlink w:anchor="_Toc234697892" w:history="1">
+      <w:hyperlink w:anchor="_Toc234806269" w:history="1">
         <w:r>
           <w:rPr>
             <w:rStyle w:val="ac"/>
@@ -7938,7 +7938,7 @@
             <w:noProof/>
             <w:webHidden/>
           </w:rPr>
-          <w:instrText>PAGEREF _Toc234697892 \h</w:instrText>
+          <w:instrText>PAGEREF _Toc234806269 \h</w:instrText>
         </w:r>
         <w:r>
           <w:rPr>
@@ -7995,7 +7995,7 @@
           <w14:ligatures w14:val="standardContextual"/>
         </w:rPr>
       </w:pPr>
-      <w:hyperlink w:anchor="_Toc234697893" w:history="1">
+      <w:hyperlink w:anchor="_Toc234806270" w:history="1">
         <w:r>
           <w:rPr>
             <w:rStyle w:val="ac"/>
@@ -8039,7 +8039,7 @@
             <w:noProof/>
             <w:webHidden/>
           </w:rPr>
-          <w:instrText>PAGEREF _Toc234697893 \h</w:instrText>
+          <w:instrText>PAGEREF _Toc234806270 \h</w:instrText>
         </w:r>
         <w:r>
           <w:rPr>
@@ -8096,7 +8096,7 @@
           <w14:ligatures w14:val="standardContextual"/>
         </w:rPr>
       </w:pPr>
-      <w:hyperlink w:anchor="_Toc234697894" w:history="1">
+      <w:hyperlink w:anchor="_Toc234806271" w:history="1">
         <w:r>
           <w:rPr>
             <w:rStyle w:val="ac"/>
@@ -8140,7 +8140,7 @@
             <w:noProof/>
             <w:webHidden/>
           </w:rPr>
-          <w:instrText>PAGEREF _Toc234697894 \h</w:instrText>
+          <w:instrText>PAGEREF _Toc234806271 \h</w:instrText>
         </w:r>
         <w:r>
           <w:rPr>
@@ -8197,7 +8197,7 @@
           <w14:ligatures w14:val="standardContextual"/>
         </w:rPr>
       </w:pPr>
-      <w:hyperlink w:anchor="_Toc234697895" w:history="1">
+      <w:hyperlink w:anchor="_Toc234806272" w:history="1">
         <w:r>
           <w:rPr>
             <w:rStyle w:val="ac"/>
@@ -8241,7 +8241,7 @@
             <w:noProof/>
             <w:webHidden/>
           </w:rPr>
-          <w:instrText>PAGEREF _Toc234697895 \h</w:instrText>
+          <w:instrText>PAGEREF _Toc234806272 \h</w:instrText>
         </w:r>
         <w:r>
           <w:rPr>
@@ -8298,7 +8298,7 @@
           <w14:ligatures w14:val="standardContextual"/>
         </w:rPr>
       </w:pPr>
-      <w:hyperlink w:anchor="_Toc234697896" w:history="1">
+      <w:hyperlink w:anchor="_Toc234806273" w:history="1">
         <w:r>
           <w:rPr>
             <w:rStyle w:val="ac"/>
@@ -8342,7 +8342,7 @@
             <w:noProof/>
             <w:webHidden/>
           </w:rPr>
-          <w:instrText>PAGEREF _Toc234697896 \h</w:instrText>
+          <w:instrText>PAGEREF _Toc234806273 \h</w:instrText>
         </w:r>
         <w:r>
           <w:rPr>
@@ -8399,7 +8399,7 @@
           <w14:ligatures w14:val="standardContextual"/>
         </w:rPr>
       </w:pPr>
-      <w:hyperlink w:anchor="_Toc234697897" w:history="1">
+      <w:hyperlink w:anchor="_Toc234806274" w:history="1">
         <w:r>
           <w:rPr>
             <w:rStyle w:val="ac"/>
@@ -8464,7 +8464,7 @@
             <w:noProof/>
             <w:webHidden/>
           </w:rPr>
-          <w:instrText>PAGEREF _Toc234697897 \h</w:instrText>
+          <w:instrText>PAGEREF _Toc234806274 \h</w:instrText>
         </w:r>
         <w:r>
           <w:rPr>
@@ -8521,7 +8521,7 @@
           <w14:ligatures w14:val="standardContextual"/>
         </w:rPr>
       </w:pPr>
-      <w:hyperlink w:anchor="_Toc234697898" w:history="1">
+      <w:hyperlink w:anchor="_Toc234806275" w:history="1">
         <w:r>
           <w:rPr>
             <w:rStyle w:val="ac"/>
@@ -8565,7 +8565,7 @@
             <w:noProof/>
             <w:webHidden/>
           </w:rPr>
-          <w:instrText>PAGEREF _Toc234697898 \h</w:instrText>
+          <w:instrText>PAGEREF _Toc234806275 \h</w:instrText>
         </w:r>
         <w:r>
           <w:rPr>
@@ -8622,7 +8622,7 @@
           <w14:ligatures w14:val="standardContextual"/>
         </w:rPr>
       </w:pPr>
-      <w:hyperlink w:anchor="_Toc234697899" w:history="1">
+      <w:hyperlink w:anchor="_Toc234806276" w:history="1">
         <w:r>
           <w:rPr>
             <w:rStyle w:val="ac"/>
@@ -8680,7 +8680,7 @@
             <w:noProof/>
             <w:webHidden/>
           </w:rPr>
-          <w:instrText>PAGEREF _Toc234697899 \h</w:instrText>
+          <w:instrText>PAGEREF _Toc234806276 \h</w:instrText>
         </w:r>
         <w:r>
           <w:rPr>
@@ -8737,7 +8737,7 @@
           <w14:ligatures w14:val="standardContextual"/>
         </w:rPr>
       </w:pPr>
-      <w:hyperlink w:anchor="_Toc234697900" w:history="1">
+      <w:hyperlink w:anchor="_Toc234806277" w:history="1">
         <w:r>
           <w:rPr>
             <w:rStyle w:val="ac"/>
@@ -8781,7 +8781,7 @@
             <w:noProof/>
             <w:webHidden/>
           </w:rPr>
-          <w:instrText>PAGEREF _Toc234697900 \h</w:instrText>
+          <w:instrText>PAGEREF _Toc234806277 \h</w:instrText>
         </w:r>
         <w:r>
           <w:rPr>
@@ -8838,7 +8838,7 @@
           <w14:ligatures w14:val="standardContextual"/>
         </w:rPr>
       </w:pPr>
-      <w:hyperlink w:anchor="_Toc234697901" w:history="1">
+      <w:hyperlink w:anchor="_Toc234806278" w:history="1">
         <w:r>
           <w:rPr>
             <w:rStyle w:val="ac"/>
@@ -8882,7 +8882,7 @@
             <w:noProof/>
             <w:webHidden/>
           </w:rPr>
-          <w:instrText>PAGEREF _Toc234697901 \h</w:instrText>
+          <w:instrText>PAGEREF _Toc234806278 \h</w:instrText>
         </w:r>
         <w:r>
           <w:rPr>
@@ -8939,7 +8939,7 @@
           <w14:ligatures w14:val="standardContextual"/>
         </w:rPr>
       </w:pPr>
-      <w:hyperlink w:anchor="_Toc234697902" w:history="1">
+      <w:hyperlink w:anchor="_Toc234806279" w:history="1">
         <w:r>
           <w:rPr>
             <w:rStyle w:val="ac"/>
@@ -8983,7 +8983,7 @@
             <w:noProof/>
             <w:webHidden/>
           </w:rPr>
-          <w:instrText>PAGEREF _Toc234697902 \h</w:instrText>
+          <w:instrText>PAGEREF _Toc234806279 \h</w:instrText>
         </w:r>
         <w:r>
           <w:rPr>
@@ -9040,7 +9040,7 @@
           <w14:ligatures w14:val="standardContextual"/>
         </w:rPr>
       </w:pPr>
-      <w:hyperlink w:anchor="_Toc234697903" w:history="1">
+      <w:hyperlink w:anchor="_Toc234806280" w:history="1">
         <w:r>
           <w:rPr>
             <w:rStyle w:val="ac"/>
@@ -9084,7 +9084,7 @@
             <w:noProof/>
             <w:webHidden/>
           </w:rPr>
-          <w:instrText>PAGEREF _Toc234697903 \h</w:instrText>
+          <w:instrText>PAGEREF _Toc234806280 \h</w:instrText>
         </w:r>
         <w:r>
           <w:rPr>
@@ -9141,7 +9141,7 @@
           <w14:ligatures w14:val="standardContextual"/>
         </w:rPr>
       </w:pPr>
-      <w:hyperlink w:anchor="_Toc234697904" w:history="1">
+      <w:hyperlink w:anchor="_Toc234806281" w:history="1">
         <w:r>
           <w:rPr>
             <w:rStyle w:val="ac"/>
@@ -9185,7 +9185,7 @@
             <w:noProof/>
             <w:webHidden/>
           </w:rPr>
-          <w:instrText>PAGEREF _Toc234697904 \h</w:instrText>
+          <w:instrText>PAGEREF _Toc234806281 \h</w:instrText>
         </w:r>
         <w:r>
           <w:rPr>
@@ -9242,7 +9242,7 @@
           <w14:ligatures w14:val="standardContextual"/>
         </w:rPr>
       </w:pPr>
-      <w:hyperlink w:anchor="_Toc234697905" w:history="1">
+      <w:hyperlink w:anchor="_Toc234806282" w:history="1">
         <w:r>
           <w:rPr>
             <w:rStyle w:val="ac"/>
@@ -9286,7 +9286,7 @@
             <w:noProof/>
             <w:webHidden/>
           </w:rPr>
-          <w:instrText>PAGEREF _Toc234697905 \h</w:instrText>
+          <w:instrText>PAGEREF _Toc234806282 \h</w:instrText>
         </w:r>
         <w:r>
           <w:rPr>
@@ -9343,7 +9343,7 @@
           <w14:ligatures w14:val="standardContextual"/>
         </w:rPr>
       </w:pPr>
-      <w:hyperlink w:anchor="_Toc234697906" w:history="1">
+      <w:hyperlink w:anchor="_Toc234806283" w:history="1">
         <w:r>
           <w:rPr>
             <w:rStyle w:val="ac"/>
@@ -9387,7 +9387,7 @@
             <w:noProof/>
             <w:webHidden/>
           </w:rPr>
-          <w:instrText>PAGEREF _Toc234697906 \h</w:instrText>
+          <w:instrText>PAGEREF _Toc234806283 \h</w:instrText>
         </w:r>
         <w:r>
           <w:rPr>
@@ -9444,7 +9444,7 @@
           <w14:ligatures w14:val="standardContextual"/>
         </w:rPr>
       </w:pPr>
-      <w:hyperlink w:anchor="_Toc234697907" w:history="1">
+      <w:hyperlink w:anchor="_Toc234806284" w:history="1">
         <w:r>
           <w:rPr>
             <w:rStyle w:val="ac"/>
@@ -9488,7 +9488,7 @@
             <w:noProof/>
             <w:webHidden/>
           </w:rPr>
-          <w:instrText>PAGEREF _Toc234697907 \h</w:instrText>
+          <w:instrText>PAGEREF _Toc234806284 \h</w:instrText>
         </w:r>
         <w:r>
           <w:rPr>
@@ -9545,7 +9545,7 @@
           <w14:ligatures w14:val="standardContextual"/>
         </w:rPr>
       </w:pPr>
-      <w:hyperlink w:anchor="_Toc234697908" w:history="1">
+      <w:hyperlink w:anchor="_Toc234806285" w:history="1">
         <w:r>
           <w:rPr>
             <w:rStyle w:val="ac"/>
@@ -9610,7 +9610,7 @@
             <w:noProof/>
             <w:webHidden/>
           </w:rPr>
-          <w:instrText>PAGEREF _Toc234697908 \h</w:instrText>
+          <w:instrText>PAGEREF _Toc234806285 \h</w:instrText>
         </w:r>
         <w:r>
           <w:rPr>
@@ -9667,7 +9667,7 @@
           <w14:ligatures w14:val="standardContextual"/>
         </w:rPr>
       </w:pPr>
-      <w:hyperlink w:anchor="_Toc234697909" w:history="1">
+      <w:hyperlink w:anchor="_Toc234806286" w:history="1">
         <w:r>
           <w:rPr>
             <w:rStyle w:val="ac"/>
@@ -9711,7 +9711,7 @@
             <w:noProof/>
             <w:webHidden/>
           </w:rPr>
-          <w:instrText>PAGEREF _Toc234697909 \h</w:instrText>
+          <w:instrText>PAGEREF _Toc234806286 \h</w:instrText>
         </w:r>
         <w:r>
           <w:rPr>
@@ -9768,7 +9768,7 @@
           <w14:ligatures w14:val="standardContextual"/>
         </w:rPr>
       </w:pPr>
-      <w:hyperlink w:anchor="_Toc234697910" w:history="1">
+      <w:hyperlink w:anchor="_Toc234806287" w:history="1">
         <w:r>
           <w:rPr>
             <w:rStyle w:val="ac"/>
@@ -9812,7 +9812,7 @@
             <w:noProof/>
             <w:webHidden/>
           </w:rPr>
-          <w:instrText>PAGEREF _Toc234697910 \h</w:instrText>
+          <w:instrText>PAGEREF _Toc234806287 \h</w:instrText>
         </w:r>
         <w:r>
           <w:rPr>
@@ -9869,7 +9869,7 @@
           <w14:ligatures w14:val="standardContextual"/>
         </w:rPr>
       </w:pPr>
-      <w:hyperlink w:anchor="_Toc234697911" w:history="1">
+      <w:hyperlink w:anchor="_Toc234806288" w:history="1">
         <w:r>
           <w:rPr>
             <w:rStyle w:val="ac"/>
@@ -9913,7 +9913,7 @@
             <w:noProof/>
             <w:webHidden/>
           </w:rPr>
-          <w:instrText>PAGEREF _Toc234697911 \h</w:instrText>
+          <w:instrText>PAGEREF _Toc234806288 \h</w:instrText>
         </w:r>
         <w:r>
           <w:rPr>
@@ -9970,7 +9970,7 @@
           <w14:ligatures w14:val="standardContextual"/>
         </w:rPr>
       </w:pPr>
-      <w:hyperlink w:anchor="_Toc234697912" w:history="1">
+      <w:hyperlink w:anchor="_Toc234806289" w:history="1">
         <w:r>
           <w:rPr>
             <w:rStyle w:val="ac"/>
@@ -10007,7 +10007,7 @@
             <w:noProof/>
             <w:webHidden/>
           </w:rPr>
-          <w:instrText>PAGEREF _Toc234697912 \h</w:instrText>
+          <w:instrText>PAGEREF _Toc234806289 \h</w:instrText>
         </w:r>
         <w:r>
           <w:rPr>
@@ -10064,7 +10064,7 @@
           <w14:ligatures w14:val="standardContextual"/>
         </w:rPr>
       </w:pPr>
-      <w:hyperlink w:anchor="_Toc234697913" w:history="1">
+      <w:hyperlink w:anchor="_Toc234806290" w:history="1">
         <w:r>
           <w:rPr>
             <w:rStyle w:val="ac"/>
@@ -10101,7 +10101,7 @@
             <w:noProof/>
             <w:webHidden/>
           </w:rPr>
-          <w:instrText>PAGEREF _Toc234697913 \h</w:instrText>
+          <w:instrText>PAGEREF _Toc234806290 \h</w:instrText>
         </w:r>
         <w:r>
           <w:rPr>
@@ -10158,7 +10158,7 @@
           <w14:ligatures w14:val="standardContextual"/>
         </w:rPr>
       </w:pPr>
-      <w:hyperlink w:anchor="_Toc234697914" w:history="1">
+      <w:hyperlink w:anchor="_Toc234806291" w:history="1">
         <w:r>
           <w:rPr>
             <w:rStyle w:val="ac"/>
@@ -10195,7 +10195,7 @@
             <w:noProof/>
             <w:webHidden/>
           </w:rPr>
-          <w:instrText>PAGEREF _Toc234697914 \h</w:instrText>
+          <w:instrText>PAGEREF _Toc234806291 \h</w:instrText>
         </w:r>
         <w:r>
           <w:rPr>
@@ -10252,7 +10252,7 @@
           <w14:ligatures w14:val="standardContextual"/>
         </w:rPr>
       </w:pPr>
-      <w:hyperlink w:anchor="_Toc234697915" w:history="1">
+      <w:hyperlink w:anchor="_Toc234806292" w:history="1">
         <w:r>
           <w:rPr>
             <w:rStyle w:val="ac"/>
@@ -10289,7 +10289,7 @@
             <w:noProof/>
             <w:webHidden/>
           </w:rPr>
-          <w:instrText>PAGEREF _Toc234697915 \h</w:instrText>
+          <w:instrText>PAGEREF _Toc234806292 \h</w:instrText>
         </w:r>
         <w:r>
           <w:rPr>
@@ -10365,7 +10365,7 @@
       <w:pPr>
         <w:pStyle w:val="ae"/>
       </w:pPr>
-      <w:bookmarkStart w:id="10" w:name="_Toc234697843"/>
+      <w:bookmarkStart w:id="10" w:name="_Toc234806220"/>
       <w:r>
         <w:lastRenderedPageBreak/>
         <w:t>第</w:t>
@@ -10389,7 +10389,7 @@
         <w:pStyle w:val="af"/>
       </w:pPr>
       <w:bookmarkStart w:id="11" w:name="引言"/>
-      <w:bookmarkStart w:id="12" w:name="_Toc234697844"/>
+      <w:bookmarkStart w:id="12" w:name="_Toc234806221"/>
       <w:r>
         <w:t xml:space="preserve">1.1 </w:t>
       </w:r>
@@ -10475,7 +10475,7 @@
         <w:pStyle w:val="af"/>
       </w:pPr>
       <w:bookmarkStart w:id="13" w:name="tex-简介"/>
-      <w:bookmarkStart w:id="14" w:name="_Toc234697845"/>
+      <w:bookmarkStart w:id="14" w:name="_Toc234806222"/>
       <w:bookmarkEnd w:id="11"/>
       <w:r>
         <w:t>1.2 TeX </w:t>
@@ -10744,7 +10744,7 @@
         <w:pStyle w:val="af0"/>
       </w:pPr>
       <w:bookmarkStart w:id="15" w:name="格式"/>
-      <w:bookmarkStart w:id="16" w:name="_Toc234697846"/>
+      <w:bookmarkStart w:id="16" w:name="_Toc234806223"/>
       <w:r>
         <w:t xml:space="preserve">1.2.1 </w:t>
       </w:r>
@@ -10900,7 +10900,7 @@
         <w:pStyle w:val="af0"/>
       </w:pPr>
       <w:bookmarkStart w:id="17" w:name="宏包"/>
-      <w:bookmarkStart w:id="18" w:name="_Toc234697847"/>
+      <w:bookmarkStart w:id="18" w:name="_Toc234806224"/>
       <w:bookmarkEnd w:id="15"/>
       <w:r>
         <w:t xml:space="preserve">1.2.2 </w:t>
@@ -11064,7 +11064,7 @@
         <w:pStyle w:val="af"/>
       </w:pPr>
       <w:bookmarkStart w:id="19" w:name="优点缺点"/>
-      <w:bookmarkStart w:id="20" w:name="_Toc234697848"/>
+      <w:bookmarkStart w:id="20" w:name="_Toc234806225"/>
       <w:bookmarkEnd w:id="13"/>
       <w:bookmarkEnd w:id="17"/>
       <w:r>
@@ -11290,7 +11290,7 @@
         <w:pStyle w:val="af"/>
       </w:pPr>
       <w:bookmarkStart w:id="21" w:name="xetex简介"/>
-      <w:bookmarkStart w:id="22" w:name="_Toc234697849"/>
+      <w:bookmarkStart w:id="22" w:name="_Toc234806226"/>
       <w:bookmarkEnd w:id="19"/>
       <w:r>
         <w:t>1.4 XeTeX</w:t>
@@ -11433,7 +11433,7 @@
         <w:pStyle w:val="af"/>
       </w:pPr>
       <w:bookmarkStart w:id="23" w:name="本章小结"/>
-      <w:bookmarkStart w:id="24" w:name="_Toc234697850"/>
+      <w:bookmarkStart w:id="24" w:name="_Toc234806227"/>
       <w:bookmarkEnd w:id="21"/>
       <w:r>
         <w:t xml:space="preserve">1.5 </w:t>
@@ -11481,7 +11481,7 @@
       <w:pPr>
         <w:pStyle w:val="ae"/>
       </w:pPr>
-      <w:bookmarkStart w:id="26" w:name="_Toc234697851"/>
+      <w:bookmarkStart w:id="26" w:name="_Toc234806228"/>
       <w:r>
         <w:lastRenderedPageBreak/>
         <w:t>第</w:t>
@@ -11564,7 +11564,7 @@
         <w:pStyle w:val="af"/>
       </w:pPr>
       <w:bookmarkStart w:id="27" w:name="windows-操作系统"/>
-      <w:bookmarkStart w:id="28" w:name="_Toc234697852"/>
+      <w:bookmarkStart w:id="28" w:name="_Toc234806229"/>
       <w:r>
         <w:t>2.1 Windows </w:t>
       </w:r>
@@ -11578,7 +11578,7 @@
         <w:pStyle w:val="af0"/>
       </w:pPr>
       <w:bookmarkStart w:id="29" w:name="安装配置"/>
-      <w:bookmarkStart w:id="30" w:name="_Toc234697853"/>
+      <w:bookmarkStart w:id="30" w:name="_Toc234806230"/>
       <w:r>
         <w:t xml:space="preserve">2.1.1 </w:t>
       </w:r>
@@ -11841,7 +11841,7 @@
         </w:rPr>
         <w:lastRenderedPageBreak/>
         <w:drawing>
-          <wp:anchor distT="0" distB="0" distL="114300" distR="114300" simplePos="0" relativeHeight="251651072" behindDoc="0" locked="0" layoutInCell="1" allowOverlap="0" wp14:anchorId="7F4CFB4F" wp14:editId="47520BE5">
+          <wp:anchor distT="0" distB="0" distL="114300" distR="114300" simplePos="0" relativeHeight="251651072" behindDoc="0" locked="0" layoutInCell="1" allowOverlap="0" wp14:anchorId="08F479D0" wp14:editId="25F1DB75">
             <wp:simplePos x="0" y="0"/>
             <wp:positionH relativeFrom="column">
               <wp:align>center</wp:align>
@@ -11965,7 +11965,7 @@
         </w:rPr>
         <w:lastRenderedPageBreak/>
         <w:drawing>
-          <wp:anchor distT="0" distB="0" distL="114300" distR="114300" simplePos="0" relativeHeight="251652096" behindDoc="0" locked="0" layoutInCell="1" allowOverlap="0" wp14:anchorId="319F3652" wp14:editId="43F3B15E">
+          <wp:anchor distT="0" distB="0" distL="114300" distR="114300" simplePos="0" relativeHeight="251652096" behindDoc="0" locked="0" layoutInCell="1" allowOverlap="0" wp14:anchorId="4A7CE880" wp14:editId="34F05DE7">
             <wp:simplePos x="0" y="0"/>
             <wp:positionH relativeFrom="column">
               <wp:align>center</wp:align>
@@ -12077,7 +12077,7 @@
           <w:noProof/>
         </w:rPr>
         <w:drawing>
-          <wp:anchor distT="0" distB="0" distL="114300" distR="114300" simplePos="0" relativeHeight="251653120" behindDoc="0" locked="0" layoutInCell="1" allowOverlap="0" wp14:anchorId="76E84B39" wp14:editId="489AAF03">
+          <wp:anchor distT="0" distB="0" distL="114300" distR="114300" simplePos="0" relativeHeight="251653120" behindDoc="0" locked="0" layoutInCell="1" allowOverlap="0" wp14:anchorId="044F33E0" wp14:editId="6D85BA64">
             <wp:simplePos x="0" y="0"/>
             <wp:positionH relativeFrom="column">
               <wp:align>center</wp:align>
@@ -12157,7 +12157,7 @@
         <w:pStyle w:val="af0"/>
       </w:pPr>
       <w:bookmarkStart w:id="34" w:name="编译运行"/>
-      <w:bookmarkStart w:id="35" w:name="_Toc234697854"/>
+      <w:bookmarkStart w:id="35" w:name="_Toc234806231"/>
       <w:bookmarkEnd w:id="29"/>
       <w:r>
         <w:t xml:space="preserve">2.1.2 </w:t>
@@ -12417,7 +12417,7 @@
         <w:pStyle w:val="af"/>
       </w:pPr>
       <w:bookmarkStart w:id="36" w:name="linux-操作系统以-ubuntu-为例"/>
-      <w:bookmarkStart w:id="37" w:name="_Toc234697855"/>
+      <w:bookmarkStart w:id="37" w:name="_Toc234806232"/>
       <w:bookmarkEnd w:id="27"/>
       <w:bookmarkEnd w:id="34"/>
       <w:r>
@@ -12448,7 +12448,7 @@
         <w:pStyle w:val="af0"/>
       </w:pPr>
       <w:bookmarkStart w:id="38" w:name="安装配置-1"/>
-      <w:bookmarkStart w:id="39" w:name="_Toc234697856"/>
+      <w:bookmarkStart w:id="39" w:name="_Toc234806233"/>
       <w:r>
         <w:t xml:space="preserve">2.2.1 </w:t>
       </w:r>
@@ -12911,7 +12911,7 @@
         <w:pStyle w:val="af0"/>
       </w:pPr>
       <w:bookmarkStart w:id="40" w:name="sec:generate-thesis"/>
-      <w:bookmarkStart w:id="41" w:name="_Toc234697857"/>
+      <w:bookmarkStart w:id="41" w:name="_Toc234806234"/>
       <w:bookmarkEnd w:id="38"/>
       <w:r>
         <w:t xml:space="preserve">2.2.2 </w:t>
@@ -13288,7 +13288,7 @@
         <w:pStyle w:val="af0"/>
       </w:pPr>
       <w:bookmarkStart w:id="46" w:name="sec:generate-auth"/>
-      <w:bookmarkStart w:id="47" w:name="_Toc234697858"/>
+      <w:bookmarkStart w:id="47" w:name="_Toc234806235"/>
       <w:bookmarkEnd w:id="40"/>
       <w:bookmarkEnd w:id="45"/>
       <w:r>
@@ -13409,7 +13409,7 @@
         <w:pStyle w:val="af0"/>
       </w:pPr>
       <w:bookmarkStart w:id="48" w:name="sec:generate-cover"/>
-      <w:bookmarkStart w:id="49" w:name="_Toc234697859"/>
+      <w:bookmarkStart w:id="49" w:name="_Toc234806236"/>
       <w:bookmarkEnd w:id="46"/>
       <w:r>
         <w:t xml:space="preserve">2.2.4 </w:t>
@@ -13581,7 +13581,7 @@
         <w:pStyle w:val="af"/>
       </w:pPr>
       <w:bookmarkStart w:id="50" w:name="字库安装"/>
-      <w:bookmarkStart w:id="51" w:name="_Toc234697860"/>
+      <w:bookmarkStart w:id="51" w:name="_Toc234806237"/>
       <w:bookmarkEnd w:id="36"/>
       <w:bookmarkEnd w:id="48"/>
       <w:r>
@@ -13709,7 +13709,7 @@
         <w:pStyle w:val="af"/>
       </w:pPr>
       <w:bookmarkStart w:id="52" w:name="本章小结-1"/>
-      <w:bookmarkStart w:id="53" w:name="_Toc234697861"/>
+      <w:bookmarkStart w:id="53" w:name="_Toc234806238"/>
       <w:bookmarkEnd w:id="50"/>
       <w:r>
         <w:t xml:space="preserve">2.4 </w:t>
@@ -13756,7 +13756,7 @@
       <w:pPr>
         <w:pStyle w:val="ae"/>
       </w:pPr>
-      <w:bookmarkStart w:id="55" w:name="_Toc234697862"/>
+      <w:bookmarkStart w:id="55" w:name="_Toc234806239"/>
       <w:r>
         <w:lastRenderedPageBreak/>
         <w:t>第</w:t>
@@ -13780,7 +13780,7 @@
         <w:pStyle w:val="af"/>
       </w:pPr>
       <w:bookmarkStart w:id="56" w:name="个人信息"/>
-      <w:bookmarkStart w:id="57" w:name="_Toc234697863"/>
+      <w:bookmarkStart w:id="57" w:name="_Toc234806240"/>
       <w:r>
         <w:t xml:space="preserve">3.1 </w:t>
       </w:r>
@@ -13846,7 +13846,7 @@
         <w:pStyle w:val="af"/>
       </w:pPr>
       <w:bookmarkStart w:id="58" w:name="模版设置"/>
-      <w:bookmarkStart w:id="59" w:name="_Toc234697864"/>
+      <w:bookmarkStart w:id="59" w:name="_Toc234806241"/>
       <w:bookmarkEnd w:id="56"/>
       <w:r>
         <w:t xml:space="preserve">3.2 </w:t>
@@ -14011,7 +14011,7 @@
         <w:pStyle w:val="af"/>
       </w:pPr>
       <w:bookmarkStart w:id="60" w:name="中英文摘要关键字"/>
-      <w:bookmarkStart w:id="61" w:name="_Toc234697865"/>
+      <w:bookmarkStart w:id="61" w:name="_Toc234806242"/>
       <w:bookmarkEnd w:id="58"/>
       <w:r>
         <w:t xml:space="preserve">3.3 </w:t>
@@ -14052,6 +14052,7 @@
         </w:numPr>
       </w:pPr>
       <w:r>
+        <w:lastRenderedPageBreak/>
         <w:t>“</w:t>
       </w:r>
       <w:r>
@@ -14073,11 +14074,7 @@
         <w:t xml:space="preserve"> </w:t>
       </w:r>
       <w:r>
-        <w:t>准计量单</w:t>
-      </w:r>
-      <w:r>
-        <w:lastRenderedPageBreak/>
-        <w:t>位制，除特殊情况外，数字一律用阿拉伯数码。文中不允许出现插图，</w:t>
+        <w:t>准计量单位制，除特殊情况外，数字一律用阿拉伯数码。文中不允许出现插图，</w:t>
       </w:r>
       <w:r>
         <w:t xml:space="preserve"> </w:t>
@@ -14127,7 +14124,7 @@
         <w:pStyle w:val="af"/>
       </w:pPr>
       <w:bookmarkStart w:id="62" w:name="正文"/>
-      <w:bookmarkStart w:id="63" w:name="_Toc234697866"/>
+      <w:bookmarkStart w:id="63" w:name="_Toc234806243"/>
       <w:bookmarkEnd w:id="60"/>
       <w:r>
         <w:t xml:space="preserve">3.4 </w:t>
@@ -14335,7 +14332,7 @@
         <w:pStyle w:val="af"/>
       </w:pPr>
       <w:bookmarkStart w:id="64" w:name="其他"/>
-      <w:bookmarkStart w:id="65" w:name="_Toc234697867"/>
+      <w:bookmarkStart w:id="65" w:name="_Toc234806244"/>
       <w:bookmarkEnd w:id="62"/>
       <w:r>
         <w:t xml:space="preserve">3.5 </w:t>
@@ -14376,7 +14373,7 @@
         <w:pStyle w:val="af"/>
       </w:pPr>
       <w:bookmarkStart w:id="66" w:name="格式设置"/>
-      <w:bookmarkStart w:id="67" w:name="_Toc234697868"/>
+      <w:bookmarkStart w:id="67" w:name="_Toc234806245"/>
       <w:bookmarkEnd w:id="64"/>
       <w:r>
         <w:lastRenderedPageBreak/>
@@ -14412,7 +14409,7 @@
         <w:pStyle w:val="af0"/>
       </w:pPr>
       <w:bookmarkStart w:id="68" w:name="字体设置"/>
-      <w:bookmarkStart w:id="69" w:name="_Toc234697869"/>
+      <w:bookmarkStart w:id="69" w:name="_Toc234806246"/>
       <w:r>
         <w:t xml:space="preserve">3.6.1 </w:t>
       </w:r>
@@ -14707,7 +14704,7 @@
         <w:pStyle w:val="af0"/>
       </w:pPr>
       <w:bookmarkStart w:id="70" w:name="字号设置"/>
-      <w:bookmarkStart w:id="71" w:name="_Toc234697870"/>
+      <w:bookmarkStart w:id="71" w:name="_Toc234806247"/>
       <w:bookmarkEnd w:id="68"/>
       <w:r>
         <w:t xml:space="preserve">3.6.2 </w:t>
@@ -15028,7 +15025,7 @@
         <w:pStyle w:val="af0"/>
       </w:pPr>
       <w:bookmarkStart w:id="72" w:name="颜色设置"/>
-      <w:bookmarkStart w:id="73" w:name="_Toc234697871"/>
+      <w:bookmarkStart w:id="73" w:name="_Toc234806248"/>
       <w:bookmarkEnd w:id="70"/>
       <w:r>
         <w:t xml:space="preserve">3.6.3 </w:t>
@@ -15149,7 +15146,7 @@
         <w:pStyle w:val="af"/>
       </w:pPr>
       <w:bookmarkStart w:id="74" w:name="本章小结-2"/>
-      <w:bookmarkStart w:id="75" w:name="_Toc234697872"/>
+      <w:bookmarkStart w:id="75" w:name="_Toc234806249"/>
       <w:bookmarkEnd w:id="66"/>
       <w:bookmarkEnd w:id="72"/>
       <w:r>
@@ -15195,7 +15192,7 @@
       <w:pPr>
         <w:pStyle w:val="ae"/>
       </w:pPr>
-      <w:bookmarkStart w:id="77" w:name="_Toc234697873"/>
+      <w:bookmarkStart w:id="77" w:name="_Toc234806250"/>
       <w:r>
         <w:lastRenderedPageBreak/>
         <w:t>第</w:t>
@@ -15219,7 +15216,7 @@
         <w:pStyle w:val="af"/>
       </w:pPr>
       <w:bookmarkStart w:id="78" w:name="绘表规范"/>
-      <w:bookmarkStart w:id="79" w:name="_Toc234697874"/>
+      <w:bookmarkStart w:id="79" w:name="_Toc234806251"/>
       <w:r>
         <w:t xml:space="preserve">4.1 </w:t>
       </w:r>
@@ -15377,7 +15374,7 @@
         <w:pStyle w:val="af"/>
       </w:pPr>
       <w:bookmarkStart w:id="80" w:name="普通表格的绘制方法"/>
-      <w:bookmarkStart w:id="81" w:name="_Toc234697875"/>
+      <w:bookmarkStart w:id="81" w:name="_Toc234806252"/>
       <w:bookmarkEnd w:id="78"/>
       <w:r>
         <w:t xml:space="preserve">4.2 </w:t>
@@ -16178,7 +16175,7 @@
           <w:noProof/>
         </w:rPr>
         <w:drawing>
-          <wp:anchor distT="0" distB="0" distL="114300" distR="114300" simplePos="0" relativeHeight="251654144" behindDoc="0" locked="0" layoutInCell="1" allowOverlap="0" wp14:anchorId="7138CFBE" wp14:editId="2B869B12">
+          <wp:anchor distT="0" distB="0" distL="114300" distR="114300" simplePos="0" relativeHeight="251654144" behindDoc="0" locked="0" layoutInCell="1" allowOverlap="0" wp14:anchorId="3E4C7A00" wp14:editId="16F12C97">
             <wp:simplePos x="0" y="0"/>
             <wp:positionH relativeFrom="column">
               <wp:align>center</wp:align>
@@ -17536,7 +17533,7 @@
         <w:pStyle w:val="af0"/>
       </w:pPr>
       <w:bookmarkStart w:id="85" w:name="多列三线表"/>
-      <w:bookmarkStart w:id="86" w:name="_Toc234697876"/>
+      <w:bookmarkStart w:id="86" w:name="_Toc234806253"/>
       <w:r>
         <w:t xml:space="preserve">4.2.1 </w:t>
       </w:r>
@@ -18186,7 +18183,7 @@
         <w:pStyle w:val="af0"/>
       </w:pPr>
       <w:bookmarkStart w:id="88" w:name="多行三线表"/>
-      <w:bookmarkStart w:id="89" w:name="_Toc234697877"/>
+      <w:bookmarkStart w:id="89" w:name="_Toc234806254"/>
       <w:bookmarkEnd w:id="85"/>
       <w:r>
         <w:t xml:space="preserve">4.2.2 </w:t>
@@ -18411,7 +18408,7 @@
         <w:pStyle w:val="af"/>
       </w:pPr>
       <w:bookmarkStart w:id="90" w:name="列宽可调表格的绘制方法"/>
-      <w:bookmarkStart w:id="91" w:name="_Toc234697878"/>
+      <w:bookmarkStart w:id="91" w:name="_Toc234806255"/>
       <w:bookmarkEnd w:id="80"/>
       <w:bookmarkEnd w:id="88"/>
       <w:r>
@@ -18447,7 +18444,7 @@
         <w:pStyle w:val="af0"/>
       </w:pPr>
       <w:bookmarkStart w:id="92" w:name="宽度控制"/>
-      <w:bookmarkStart w:id="93" w:name="_Toc234697879"/>
+      <w:bookmarkStart w:id="93" w:name="_Toc234806256"/>
       <w:r>
         <w:t xml:space="preserve">4.3.1 </w:t>
       </w:r>
@@ -18854,7 +18851,7 @@
         <w:pStyle w:val="af0"/>
       </w:pPr>
       <w:bookmarkStart w:id="95" w:name="表格内某单元格内容过长的情况"/>
-      <w:bookmarkStart w:id="96" w:name="_Toc234697880"/>
+      <w:bookmarkStart w:id="96" w:name="_Toc234806257"/>
       <w:bookmarkEnd w:id="92"/>
       <w:r>
         <w:t xml:space="preserve">4.3.2 </w:t>
@@ -19464,7 +19461,7 @@
         <w:pStyle w:val="af"/>
       </w:pPr>
       <w:bookmarkStart w:id="98" w:name="斜线表头"/>
-      <w:bookmarkStart w:id="99" w:name="_Toc234697881"/>
+      <w:bookmarkStart w:id="99" w:name="_Toc234806258"/>
       <w:bookmarkEnd w:id="90"/>
       <w:bookmarkEnd w:id="95"/>
       <w:r>
@@ -20282,7 +20279,7 @@
         <w:pStyle w:val="af"/>
       </w:pPr>
       <w:bookmarkStart w:id="102" w:name="表格的列按小数点对齐"/>
-      <w:bookmarkStart w:id="103" w:name="_Toc234697882"/>
+      <w:bookmarkStart w:id="103" w:name="_Toc234806259"/>
       <w:bookmarkEnd w:id="98"/>
       <w:r>
         <w:t xml:space="preserve">4.5 </w:t>
@@ -20560,7 +20557,7 @@
         <w:pStyle w:val="af"/>
       </w:pPr>
       <w:bookmarkStart w:id="104" w:name="对物理量符号进行注释的情况"/>
-      <w:bookmarkStart w:id="105" w:name="_Toc234697883"/>
+      <w:bookmarkStart w:id="105" w:name="_Toc234806260"/>
       <w:bookmarkEnd w:id="102"/>
       <w:r>
         <w:lastRenderedPageBreak/>
@@ -22721,7 +22718,7 @@
         <w:pStyle w:val="af"/>
       </w:pPr>
       <w:bookmarkStart w:id="109" w:name="罗列"/>
-      <w:bookmarkStart w:id="110" w:name="_Toc234697884"/>
+      <w:bookmarkStart w:id="110" w:name="_Toc234806261"/>
       <w:bookmarkEnd w:id="104"/>
       <w:bookmarkEnd w:id="107"/>
       <w:bookmarkEnd w:id="108"/>
@@ -22785,7 +22782,7 @@
           <w:noProof/>
         </w:rPr>
         <w:drawing>
-          <wp:anchor distT="0" distB="0" distL="114300" distR="114300" simplePos="0" relativeHeight="251655168" behindDoc="0" locked="0" layoutInCell="1" allowOverlap="0" wp14:anchorId="65F7BC81" wp14:editId="6C079F31">
+          <wp:anchor distT="0" distB="0" distL="114300" distR="114300" simplePos="0" relativeHeight="251655168" behindDoc="0" locked="0" layoutInCell="1" allowOverlap="0" wp14:anchorId="3D48677C" wp14:editId="1DB6D697">
             <wp:simplePos x="0" y="0"/>
             <wp:positionH relativeFrom="column">
               <wp:align>center</wp:align>
@@ -22802,7 +22799,7 @@
               <a:graphicData uri="http://schemas.openxmlformats.org/drawingml/2006/picture">
                 <pic:pic xmlns:pic="http://schemas.openxmlformats.org/drawingml/2006/picture">
                   <pic:nvPicPr>
-                    <pic:cNvPr id="96" name="Picture" descr="list.eps"/>
+                    <pic:cNvPr id="96" name="Picture" descr="C:/Users/THINKPAD/AppData/Local/Temp/heuthesis_l2w_xkl9w0zj/graphics/list-6dd364989bf8.png"/>
                     <pic:cNvPicPr>
                       <a:picLocks noChangeAspect="1" noChangeArrowheads="1"/>
                     </pic:cNvPicPr>
@@ -23424,7 +23421,7 @@
         <w:pStyle w:val="af"/>
       </w:pPr>
       <w:bookmarkStart w:id="112" w:name="本章小结-3"/>
-      <w:bookmarkStart w:id="113" w:name="_Toc234697885"/>
+      <w:bookmarkStart w:id="113" w:name="_Toc234806262"/>
       <w:bookmarkEnd w:id="109"/>
       <w:r>
         <w:t xml:space="preserve">4.8 </w:t>
@@ -23468,7 +23465,7 @@
       <w:pPr>
         <w:pStyle w:val="ae"/>
       </w:pPr>
-      <w:bookmarkStart w:id="115" w:name="_Toc234697886"/>
+      <w:bookmarkStart w:id="115" w:name="_Toc234806263"/>
       <w:r>
         <w:lastRenderedPageBreak/>
         <w:t>第</w:t>
@@ -23492,7 +23489,7 @@
         <w:pStyle w:val="af"/>
       </w:pPr>
       <w:bookmarkStart w:id="116" w:name="插图规范"/>
-      <w:bookmarkStart w:id="117" w:name="_Toc234697887"/>
+      <w:bookmarkStart w:id="117" w:name="_Toc234806264"/>
       <w:r>
         <w:t xml:space="preserve">5.1 </w:t>
       </w:r>
@@ -23602,7 +23599,7 @@
         <w:pStyle w:val="af0"/>
       </w:pPr>
       <w:bookmarkStart w:id="118" w:name="图题及图中说明"/>
-      <w:bookmarkStart w:id="119" w:name="_Toc234697888"/>
+      <w:bookmarkStart w:id="119" w:name="_Toc234806265"/>
       <w:r>
         <w:t xml:space="preserve">5.1.1 </w:t>
       </w:r>
@@ -23692,7 +23689,7 @@
         <w:pStyle w:val="af0"/>
       </w:pPr>
       <w:bookmarkStart w:id="120" w:name="插图编排"/>
-      <w:bookmarkStart w:id="121" w:name="_Toc234697889"/>
+      <w:bookmarkStart w:id="121" w:name="_Toc234806266"/>
       <w:bookmarkEnd w:id="118"/>
       <w:r>
         <w:lastRenderedPageBreak/>
@@ -23752,7 +23749,7 @@
         <w:pStyle w:val="af"/>
       </w:pPr>
       <w:bookmarkStart w:id="122" w:name="latex-中推荐使用的图片格式"/>
-      <w:bookmarkStart w:id="123" w:name="_Toc234697890"/>
+      <w:bookmarkStart w:id="123" w:name="_Toc234806267"/>
       <w:bookmarkEnd w:id="116"/>
       <w:bookmarkEnd w:id="120"/>
       <w:r>
@@ -23818,7 +23815,7 @@
         <w:pStyle w:val="af"/>
       </w:pPr>
       <w:bookmarkStart w:id="124" w:name="单张图片"/>
-      <w:bookmarkStart w:id="125" w:name="_Toc234697891"/>
+      <w:bookmarkStart w:id="125" w:name="_Toc234806268"/>
       <w:bookmarkEnd w:id="122"/>
       <w:r>
         <w:t xml:space="preserve">5.3 </w:t>
@@ -23958,7 +23955,7 @@
         </w:rPr>
         <w:lastRenderedPageBreak/>
         <w:drawing>
-          <wp:anchor distT="0" distB="0" distL="114300" distR="114300" simplePos="0" relativeHeight="251656192" behindDoc="0" locked="0" layoutInCell="1" allowOverlap="0" wp14:anchorId="7B72FE14" wp14:editId="058A3909">
+          <wp:anchor distT="0" distB="0" distL="114300" distR="114300" simplePos="0" relativeHeight="251656192" behindDoc="0" locked="0" layoutInCell="1" allowOverlap="0" wp14:anchorId="0A5330D5" wp14:editId="348503EB">
             <wp:simplePos x="0" y="0"/>
             <wp:positionH relativeFrom="column">
               <wp:align>center</wp:align>
@@ -24790,7 +24787,7 @@
         <w:pStyle w:val="af"/>
       </w:pPr>
       <w:bookmarkStart w:id="129" w:name="并排图和子图"/>
-      <w:bookmarkStart w:id="130" w:name="_Toc234697892"/>
+      <w:bookmarkStart w:id="130" w:name="_Toc234806269"/>
       <w:bookmarkEnd w:id="124"/>
       <w:r>
         <w:lastRenderedPageBreak/>
@@ -24806,7 +24803,7 @@
         <w:pStyle w:val="af0"/>
       </w:pPr>
       <w:bookmarkStart w:id="131" w:name="双图并列"/>
-      <w:bookmarkStart w:id="132" w:name="_Toc234697893"/>
+      <w:bookmarkStart w:id="132" w:name="_Toc234806270"/>
       <w:r>
         <w:t xml:space="preserve">5.4.1 </w:t>
       </w:r>
@@ -24855,8 +24852,10 @@
     </w:p>
     <w:tbl>
       <w:tblPr>
+        <w:tblStyle w:val="FigureTable"/>
         <w:tblW w:w="0" w:type="auto"/>
         <w:jc w:val="center"/>
+        <w:tblInd w:w="0" w:type="dxa"/>
         <w:tblBorders>
           <w:top w:val="nil"/>
           <w:left w:val="nil"/>
@@ -24865,13 +24864,27 @@
           <w:insideH w:val="nil"/>
           <w:insideV w:val="nil"/>
         </w:tblBorders>
+        <w:tblCellMar>
+          <w:top w:w="0" w:type="dxa"/>
+          <w:left w:w="0" w:type="dxa"/>
+          <w:bottom w:w="0" w:type="dxa"/>
+          <w:right w:w="0" w:type="dxa"/>
+        </w:tblCellMar>
         <w:tblLook w:val="0600" w:firstRow="0" w:lastRow="0" w:firstColumn="0" w:lastColumn="0" w:noHBand="1" w:noVBand="1"/>
       </w:tblPr>
       <w:tblGrid>
-        <w:gridCol w:w="2616"/>
-        <w:gridCol w:w="2616"/>
+        <w:gridCol w:w="2400"/>
+        <w:gridCol w:w="2400"/>
       </w:tblGrid>
       <w:tr>
+        <w:tblPrEx>
+          <w:tblCellMar>
+            <w:top w:w="0" w:type="dxa"/>
+            <w:left w:w="0" w:type="dxa"/>
+            <w:bottom w:w="0" w:type="dxa"/>
+            <w:right w:w="0" w:type="dxa"/>
+          </w:tblCellMar>
+        </w:tblPrEx>
         <w:trPr>
           <w:jc w:val="center"/>
         </w:trPr>
@@ -24897,7 +24910,7 @@
                 <w:noProof/>
               </w:rPr>
               <w:drawing>
-                <wp:anchor distT="0" distB="0" distL="114300" distR="114300" simplePos="0" relativeHeight="251657216" behindDoc="0" locked="0" layoutInCell="1" allowOverlap="0" wp14:anchorId="22BAB3D0" wp14:editId="6F90E61C">
+                <wp:anchor distT="0" distB="0" distL="114300" distR="114300" simplePos="0" relativeHeight="251657216" behindDoc="0" locked="0" layoutInCell="1" allowOverlap="0" wp14:anchorId="6DF40C1C" wp14:editId="468181C9">
                   <wp:simplePos x="0" y="0"/>
                   <wp:positionH relativeFrom="column">
                     <wp:align>center</wp:align>
@@ -24969,7 +24982,7 @@
                 <w:noProof/>
               </w:rPr>
               <w:drawing>
-                <wp:anchor distT="0" distB="0" distL="114300" distR="114300" simplePos="0" relativeHeight="251658240" behindDoc="0" locked="0" layoutInCell="1" allowOverlap="0" wp14:anchorId="24D8BF2D" wp14:editId="2A2AF6B1">
+                <wp:anchor distT="0" distB="0" distL="114300" distR="114300" simplePos="0" relativeHeight="251658240" behindDoc="0" locked="0" layoutInCell="1" allowOverlap="0" wp14:anchorId="715CE059" wp14:editId="1317987E">
                   <wp:simplePos x="0" y="0"/>
                   <wp:positionH relativeFrom="column">
                     <wp:align>center</wp:align>
@@ -25264,8 +25277,10 @@
     </w:p>
     <w:tbl>
       <w:tblPr>
+        <w:tblStyle w:val="FigureTable"/>
         <w:tblW w:w="0" w:type="auto"/>
         <w:jc w:val="center"/>
+        <w:tblInd w:w="0" w:type="dxa"/>
         <w:tblBorders>
           <w:top w:val="nil"/>
           <w:left w:val="nil"/>
@@ -25274,13 +25289,27 @@
           <w:insideH w:val="nil"/>
           <w:insideV w:val="nil"/>
         </w:tblBorders>
+        <w:tblCellMar>
+          <w:top w:w="0" w:type="dxa"/>
+          <w:left w:w="0" w:type="dxa"/>
+          <w:bottom w:w="0" w:type="dxa"/>
+          <w:right w:w="0" w:type="dxa"/>
+        </w:tblCellMar>
         <w:tblLook w:val="0600" w:firstRow="0" w:lastRow="0" w:firstColumn="0" w:lastColumn="0" w:noHBand="1" w:noVBand="1"/>
       </w:tblPr>
       <w:tblGrid>
-        <w:gridCol w:w="4416"/>
-        <w:gridCol w:w="4416"/>
+        <w:gridCol w:w="4200"/>
+        <w:gridCol w:w="4200"/>
       </w:tblGrid>
       <w:tr>
+        <w:tblPrEx>
+          <w:tblCellMar>
+            <w:top w:w="0" w:type="dxa"/>
+            <w:left w:w="0" w:type="dxa"/>
+            <w:bottom w:w="0" w:type="dxa"/>
+            <w:right w:w="0" w:type="dxa"/>
+          </w:tblCellMar>
+        </w:tblPrEx>
         <w:trPr>
           <w:jc w:val="center"/>
         </w:trPr>
@@ -25306,7 +25335,7 @@
                 <w:noProof/>
               </w:rPr>
               <w:drawing>
-                <wp:anchor distT="0" distB="0" distL="114300" distR="114300" simplePos="0" relativeHeight="251659264" behindDoc="0" locked="0" layoutInCell="1" allowOverlap="0" wp14:anchorId="4D46B9DE" wp14:editId="2D55641F">
+                <wp:anchor distT="0" distB="0" distL="114300" distR="114300" simplePos="0" relativeHeight="251659264" behindDoc="0" locked="0" layoutInCell="1" allowOverlap="0" wp14:anchorId="0B41CB74" wp14:editId="7626E506">
                   <wp:simplePos x="0" y="0"/>
                   <wp:positionH relativeFrom="column">
                     <wp:align>center</wp:align>
@@ -25378,7 +25407,7 @@
                 <w:noProof/>
               </w:rPr>
               <w:drawing>
-                <wp:anchor distT="0" distB="0" distL="114300" distR="114300" simplePos="0" relativeHeight="251660288" behindDoc="0" locked="0" layoutInCell="1" allowOverlap="0" wp14:anchorId="3FEED75F" wp14:editId="48C936BF">
+                <wp:anchor distT="0" distB="0" distL="114300" distR="114300" simplePos="0" relativeHeight="251660288" behindDoc="0" locked="0" layoutInCell="1" allowOverlap="0" wp14:anchorId="4D2D06BF" wp14:editId="5368B90F">
                   <wp:simplePos x="0" y="0"/>
                   <wp:positionH relativeFrom="column">
                     <wp:align>center</wp:align>
@@ -25448,8 +25477,10 @@
     </w:p>
     <w:tbl>
       <w:tblPr>
+        <w:tblStyle w:val="FigureTable"/>
         <w:tblW w:w="0" w:type="auto"/>
         <w:jc w:val="center"/>
+        <w:tblInd w:w="0" w:type="dxa"/>
         <w:tblBorders>
           <w:top w:val="nil"/>
           <w:left w:val="nil"/>
@@ -25458,13 +25489,27 @@
           <w:insideH w:val="nil"/>
           <w:insideV w:val="nil"/>
         </w:tblBorders>
+        <w:tblCellMar>
+          <w:top w:w="0" w:type="dxa"/>
+          <w:left w:w="0" w:type="dxa"/>
+          <w:bottom w:w="0" w:type="dxa"/>
+          <w:right w:w="0" w:type="dxa"/>
+        </w:tblCellMar>
         <w:tblLook w:val="0600" w:firstRow="0" w:lastRow="0" w:firstColumn="0" w:lastColumn="0" w:noHBand="1" w:noVBand="1"/>
       </w:tblPr>
       <w:tblGrid>
-        <w:gridCol w:w="4416"/>
-        <w:gridCol w:w="4416"/>
+        <w:gridCol w:w="4200"/>
+        <w:gridCol w:w="4200"/>
       </w:tblGrid>
       <w:tr>
+        <w:tblPrEx>
+          <w:tblCellMar>
+            <w:top w:w="0" w:type="dxa"/>
+            <w:left w:w="0" w:type="dxa"/>
+            <w:bottom w:w="0" w:type="dxa"/>
+            <w:right w:w="0" w:type="dxa"/>
+          </w:tblCellMar>
+        </w:tblPrEx>
         <w:trPr>
           <w:jc w:val="center"/>
         </w:trPr>
@@ -25492,7 +25537,7 @@
               </w:rPr>
               <w:lastRenderedPageBreak/>
               <w:drawing>
-                <wp:anchor distT="0" distB="0" distL="114300" distR="114300" simplePos="0" relativeHeight="251661312" behindDoc="0" locked="0" layoutInCell="1" allowOverlap="0" wp14:anchorId="6A46120E" wp14:editId="1D2F86AB">
+                <wp:anchor distT="0" distB="0" distL="114300" distR="114300" simplePos="0" relativeHeight="251661312" behindDoc="0" locked="0" layoutInCell="1" allowOverlap="0" wp14:anchorId="73904EF6" wp14:editId="02321D65">
                   <wp:simplePos x="0" y="0"/>
                   <wp:positionH relativeFrom="column">
                     <wp:align>center</wp:align>
@@ -25564,7 +25609,7 @@
                 <w:noProof/>
               </w:rPr>
               <w:drawing>
-                <wp:anchor distT="0" distB="0" distL="114300" distR="114300" simplePos="0" relativeHeight="251662336" behindDoc="0" locked="0" layoutInCell="1" allowOverlap="0" wp14:anchorId="434E10F5" wp14:editId="24ED61BE">
+                <wp:anchor distT="0" distB="0" distL="114300" distR="114300" simplePos="0" relativeHeight="251662336" behindDoc="0" locked="0" layoutInCell="1" allowOverlap="0" wp14:anchorId="579E6011" wp14:editId="71D844BE">
                   <wp:simplePos x="0" y="0"/>
                   <wp:positionH relativeFrom="column">
                     <wp:align>center</wp:align>
@@ -25634,8 +25679,10 @@
     </w:p>
     <w:tbl>
       <w:tblPr>
+        <w:tblStyle w:val="FigureTable"/>
         <w:tblW w:w="0" w:type="auto"/>
         <w:jc w:val="center"/>
+        <w:tblInd w:w="0" w:type="dxa"/>
         <w:tblBorders>
           <w:top w:val="nil"/>
           <w:left w:val="nil"/>
@@ -25644,13 +25691,27 @@
           <w:insideH w:val="nil"/>
           <w:insideV w:val="nil"/>
         </w:tblBorders>
+        <w:tblCellMar>
+          <w:top w:w="0" w:type="dxa"/>
+          <w:left w:w="0" w:type="dxa"/>
+          <w:bottom w:w="0" w:type="dxa"/>
+          <w:right w:w="0" w:type="dxa"/>
+        </w:tblCellMar>
         <w:tblLook w:val="0600" w:firstRow="0" w:lastRow="0" w:firstColumn="0" w:lastColumn="0" w:noHBand="1" w:noVBand="1"/>
       </w:tblPr>
       <w:tblGrid>
-        <w:gridCol w:w="4416"/>
-        <w:gridCol w:w="4416"/>
+        <w:gridCol w:w="4200"/>
+        <w:gridCol w:w="4200"/>
       </w:tblGrid>
       <w:tr>
+        <w:tblPrEx>
+          <w:tblCellMar>
+            <w:top w:w="0" w:type="dxa"/>
+            <w:left w:w="0" w:type="dxa"/>
+            <w:bottom w:w="0" w:type="dxa"/>
+            <w:right w:w="0" w:type="dxa"/>
+          </w:tblCellMar>
+        </w:tblPrEx>
         <w:trPr>
           <w:jc w:val="center"/>
         </w:trPr>
@@ -25677,7 +25738,7 @@
                 <w:noProof/>
               </w:rPr>
               <w:drawing>
-                <wp:anchor distT="0" distB="0" distL="114300" distR="114300" simplePos="0" relativeHeight="251663360" behindDoc="0" locked="0" layoutInCell="1" allowOverlap="0" wp14:anchorId="41CB8E97" wp14:editId="392A0528">
+                <wp:anchor distT="0" distB="0" distL="114300" distR="114300" simplePos="0" relativeHeight="251663360" behindDoc="0" locked="0" layoutInCell="1" allowOverlap="0" wp14:anchorId="10D21254" wp14:editId="6615EA2B">
                   <wp:simplePos x="0" y="0"/>
                   <wp:positionH relativeFrom="column">
                     <wp:align>center</wp:align>
@@ -25749,7 +25810,7 @@
                 <w:noProof/>
               </w:rPr>
               <w:drawing>
-                <wp:anchor distT="0" distB="0" distL="114300" distR="114300" simplePos="0" relativeHeight="251664384" behindDoc="0" locked="0" layoutInCell="1" allowOverlap="0" wp14:anchorId="1C14A241" wp14:editId="5EA15F78">
+                <wp:anchor distT="0" distB="0" distL="114300" distR="114300" simplePos="0" relativeHeight="251664384" behindDoc="0" locked="0" layoutInCell="1" allowOverlap="0" wp14:anchorId="71C562A9" wp14:editId="3C66F4F1">
                   <wp:simplePos x="0" y="0"/>
                   <wp:positionH relativeFrom="column">
                     <wp:align>center</wp:align>
@@ -25822,7 +25883,7 @@
         <w:pStyle w:val="af0"/>
       </w:pPr>
       <w:bookmarkStart w:id="137" w:name="子图"/>
-      <w:bookmarkStart w:id="138" w:name="_Toc234697894"/>
+      <w:bookmarkStart w:id="138" w:name="_Toc234806271"/>
       <w:bookmarkEnd w:id="131"/>
       <w:bookmarkEnd w:id="136"/>
       <w:r>
@@ -26128,25 +26189,74 @@
         <w:t>命令进行嵌套的方法来实现子图的中英文标题功能。</w:t>
       </w:r>
     </w:p>
+    <w:p>
+      <w:pPr>
+        <w:pStyle w:val="af2"/>
+        <w:keepLines/>
+      </w:pPr>
+      <w:bookmarkStart w:id="140" w:name="golfer4"/>
+      <w:r>
+        <w:t>图</w:t>
+      </w:r>
+      <w:r>
+        <w:t xml:space="preserve"> 5.8 </w:t>
+      </w:r>
+      <w:r>
+        <w:t>打高尔夫球的人</w:t>
+      </w:r>
+    </w:p>
+    <w:p>
+      <w:pPr>
+        <w:pStyle w:val="af2"/>
+        <w:keepLines/>
+      </w:pPr>
+      <w:bookmarkStart w:id="141" w:name="golfer47"/>
+      <w:bookmarkEnd w:id="140"/>
+      <w:r>
+        <w:t>图</w:t>
+      </w:r>
+      <w:r>
+        <w:t xml:space="preserve"> 5.9 </w:t>
+      </w:r>
+      <w:r>
+        <w:t>打高尔夫球的人</w:t>
+      </w:r>
+    </w:p>
     <w:tbl>
       <w:tblPr>
+        <w:tblStyle w:val="FigureTable"/>
         <w:tblW w:w="0" w:type="auto"/>
         <w:jc w:val="center"/>
+        <w:tblInd w:w="0" w:type="dxa"/>
         <w:tblBorders>
-          <w:top w:val="single" w:sz="12" w:space="0" w:color="auto"/>
+          <w:top w:val="nil"/>
           <w:left w:val="nil"/>
-          <w:bottom w:val="single" w:sz="12" w:space="0" w:color="auto"/>
+          <w:bottom w:val="nil"/>
           <w:right w:val="nil"/>
           <w:insideH w:val="nil"/>
           <w:insideV w:val="nil"/>
         </w:tblBorders>
+        <w:tblCellMar>
+          <w:top w:w="0" w:type="dxa"/>
+          <w:left w:w="0" w:type="dxa"/>
+          <w:bottom w:w="0" w:type="dxa"/>
+          <w:right w:w="0" w:type="dxa"/>
+        </w:tblCellMar>
         <w:tblLook w:val="0600" w:firstRow="0" w:lastRow="0" w:firstColumn="0" w:lastColumn="0" w:noHBand="1" w:noVBand="1"/>
       </w:tblPr>
       <w:tblGrid>
-        <w:gridCol w:w="222"/>
-        <w:gridCol w:w="222"/>
+        <w:gridCol w:w="875"/>
+        <w:gridCol w:w="889"/>
       </w:tblGrid>
       <w:tr>
+        <w:tblPrEx>
+          <w:tblCellMar>
+            <w:top w:w="0" w:type="dxa"/>
+            <w:left w:w="0" w:type="dxa"/>
+            <w:bottom w:w="0" w:type="dxa"/>
+            <w:right w:w="0" w:type="dxa"/>
+          </w:tblCellMar>
+        </w:tblPrEx>
         <w:trPr>
           <w:jc w:val="center"/>
         </w:trPr>
@@ -26154,166 +26264,30 @@
           <w:tcPr>
             <w:tcW w:w="0" w:type="auto"/>
             <w:tcBorders>
-              <w:bottom w:val="single" w:sz="8" w:space="0" w:color="auto"/>
+              <w:top w:val="nil"/>
+              <w:left w:val="nil"/>
+              <w:bottom w:val="nil"/>
+              <w:right w:val="nil"/>
             </w:tcBorders>
           </w:tcPr>
           <w:p>
             <w:pPr>
-              <w:spacing w:line="273" w:lineRule="exact"/>
-              <w:ind w:firstLine="0"/>
-            </w:pPr>
-            <w:bookmarkStart w:id="140" w:name="golfer4"/>
-          </w:p>
-        </w:tc>
-        <w:tc>
-          <w:tcPr>
-            <w:tcW w:w="0" w:type="auto"/>
-            <w:tcBorders>
-              <w:bottom w:val="single" w:sz="8" w:space="0" w:color="auto"/>
-            </w:tcBorders>
-          </w:tcPr>
-          <w:p>
-            <w:pPr>
-              <w:spacing w:line="273" w:lineRule="exact"/>
-              <w:ind w:firstLine="0"/>
-            </w:pPr>
-          </w:p>
-        </w:tc>
-      </w:tr>
-    </w:tbl>
-    <w:p>
-      <w:pPr>
-        <w:pStyle w:val="af2"/>
-        <w:keepLines/>
-      </w:pPr>
-      <w:r>
-        <w:t>图</w:t>
-      </w:r>
-      <w:r>
-        <w:t xml:space="preserve"> 5.8 </w:t>
-      </w:r>
-      <w:r>
-        <w:t>打高尔夫球的人</w:t>
-      </w:r>
-    </w:p>
-    <w:tbl>
-      <w:tblPr>
-        <w:tblW w:w="0" w:type="auto"/>
-        <w:jc w:val="center"/>
-        <w:tblBorders>
-          <w:top w:val="single" w:sz="12" w:space="0" w:color="auto"/>
-          <w:left w:val="nil"/>
-          <w:bottom w:val="single" w:sz="12" w:space="0" w:color="auto"/>
-          <w:right w:val="nil"/>
-          <w:insideH w:val="nil"/>
-          <w:insideV w:val="nil"/>
-        </w:tblBorders>
-        <w:tblLook w:val="0600" w:firstRow="0" w:lastRow="0" w:firstColumn="0" w:lastColumn="0" w:noHBand="1" w:noVBand="1"/>
-      </w:tblPr>
-      <w:tblGrid>
-        <w:gridCol w:w="222"/>
-      </w:tblGrid>
-      <w:tr>
-        <w:trPr>
-          <w:jc w:val="center"/>
-        </w:trPr>
-        <w:tc>
-          <w:tcPr>
-            <w:tcW w:w="0" w:type="auto"/>
-            <w:tcBorders>
-              <w:bottom w:val="single" w:sz="8" w:space="0" w:color="auto"/>
-            </w:tcBorders>
-          </w:tcPr>
-          <w:p>
-            <w:pPr>
-              <w:spacing w:line="273" w:lineRule="exact"/>
-              <w:ind w:firstLine="0"/>
-            </w:pPr>
-            <w:bookmarkStart w:id="141" w:name="golfer47"/>
-            <w:bookmarkEnd w:id="140"/>
-          </w:p>
-        </w:tc>
-      </w:tr>
-    </w:tbl>
-    <w:p>
-      <w:pPr>
-        <w:pStyle w:val="af2"/>
-        <w:keepLines/>
-      </w:pPr>
-      <w:r>
-        <w:t>图</w:t>
-      </w:r>
-      <w:r>
-        <w:t xml:space="preserve"> 5.9 </w:t>
-      </w:r>
-      <w:r>
-        <w:t>打高尔夫球的人</w:t>
-      </w:r>
-    </w:p>
-    <w:tbl>
-      <w:tblPr>
-        <w:tblW w:w="0" w:type="auto"/>
-        <w:jc w:val="center"/>
-        <w:tblBorders>
-          <w:top w:val="single" w:sz="12" w:space="0" w:color="auto"/>
-          <w:left w:val="nil"/>
-          <w:bottom w:val="single" w:sz="12" w:space="0" w:color="auto"/>
-          <w:right w:val="nil"/>
-          <w:insideH w:val="nil"/>
-          <w:insideV w:val="nil"/>
-        </w:tblBorders>
-        <w:tblLook w:val="0600" w:firstRow="0" w:lastRow="0" w:firstColumn="0" w:lastColumn="0" w:noHBand="1" w:noVBand="1"/>
-      </w:tblPr>
-      <w:tblGrid>
-        <w:gridCol w:w="982"/>
-        <w:gridCol w:w="994"/>
-      </w:tblGrid>
-      <w:tr>
-        <w:trPr>
-          <w:jc w:val="center"/>
-        </w:trPr>
-        <w:tc>
-          <w:tcPr>
-            <w:tcW w:w="0" w:type="auto"/>
-            <w:tcBorders>
-              <w:bottom w:val="single" w:sz="8" w:space="0" w:color="auto"/>
-            </w:tcBorders>
-          </w:tcPr>
-          <w:p>
-            <w:pPr>
-              <w:pStyle w:val="10"/>
-              <w:spacing w:line="273" w:lineRule="exact"/>
-              <w:ind w:firstLine="0"/>
-              <w:jc w:val="center"/>
+              <w:pStyle w:val="af3"/>
             </w:pPr>
             <w:bookmarkStart w:id="142" w:name="golfer0"/>
             <w:bookmarkEnd w:id="141"/>
             <w:r>
-              <w:rPr>
-                <w:sz w:val="21"/>
-              </w:rPr>
               <w:t>(a)</w:t>
             </w:r>
           </w:p>
           <w:p>
             <w:pPr>
-              <w:pStyle w:val="10"/>
-              <w:spacing w:line="273" w:lineRule="exact"/>
-              <w:ind w:firstLine="0"/>
-              <w:jc w:val="center"/>
+              <w:pStyle w:val="af3"/>
             </w:pPr>
             <w:r>
-              <w:rPr>
-                <w:rFonts w:hint="eastAsia"/>
-                <w:sz w:val="21"/>
-              </w:rPr>
               <w:t>a</w:t>
             </w:r>
             <w:r>
-              <w:rPr>
-                <w:rFonts w:hint="eastAsia"/>
-                <w:sz w:val="21"/>
-              </w:rPr>
               <w:t>点说明</w:t>
             </w:r>
           </w:p>
@@ -26322,42 +26296,28 @@
           <w:tcPr>
             <w:tcW w:w="0" w:type="auto"/>
             <w:tcBorders>
-              <w:bottom w:val="single" w:sz="8" w:space="0" w:color="auto"/>
+              <w:top w:val="nil"/>
+              <w:left w:val="nil"/>
+              <w:bottom w:val="nil"/>
+              <w:right w:val="nil"/>
             </w:tcBorders>
           </w:tcPr>
           <w:p>
             <w:pPr>
-              <w:pStyle w:val="10"/>
-              <w:spacing w:line="273" w:lineRule="exact"/>
-              <w:ind w:firstLine="0"/>
-              <w:jc w:val="center"/>
+              <w:pStyle w:val="af3"/>
             </w:pPr>
             <w:r>
-              <w:rPr>
-                <w:sz w:val="21"/>
-              </w:rPr>
               <w:t>(b)</w:t>
             </w:r>
           </w:p>
           <w:p>
             <w:pPr>
-              <w:pStyle w:val="10"/>
-              <w:spacing w:line="273" w:lineRule="exact"/>
-              <w:ind w:firstLine="0"/>
-              <w:jc w:val="center"/>
+              <w:pStyle w:val="af3"/>
             </w:pPr>
             <w:r>
-              <w:rPr>
-                <w:rFonts w:hint="eastAsia"/>
-                <w:sz w:val="21"/>
-              </w:rPr>
               <w:t>b</w:t>
             </w:r>
             <w:r>
-              <w:rPr>
-                <w:rFonts w:hint="eastAsia"/>
-                <w:sz w:val="21"/>
-              </w:rPr>
               <w:t>点说明</w:t>
             </w:r>
           </w:p>
@@ -26379,50 +26339,13 @@
         <w:t>打高尔夫球球的人</w:t>
       </w:r>
     </w:p>
-    <w:tbl>
-      <w:tblPr>
-        <w:tblW w:w="0" w:type="auto"/>
-        <w:jc w:val="center"/>
-        <w:tblBorders>
-          <w:top w:val="single" w:sz="12" w:space="0" w:color="auto"/>
-          <w:left w:val="nil"/>
-          <w:bottom w:val="single" w:sz="12" w:space="0" w:color="auto"/>
-          <w:right w:val="nil"/>
-          <w:insideH w:val="nil"/>
-          <w:insideV w:val="nil"/>
-        </w:tblBorders>
-        <w:tblLook w:val="0600" w:firstRow="0" w:lastRow="0" w:firstColumn="0" w:lastColumn="0" w:noHBand="1" w:noVBand="1"/>
-      </w:tblPr>
-      <w:tblGrid>
-        <w:gridCol w:w="222"/>
-      </w:tblGrid>
-      <w:tr>
-        <w:trPr>
-          <w:jc w:val="center"/>
-        </w:trPr>
-        <w:tc>
-          <w:tcPr>
-            <w:tcW w:w="0" w:type="auto"/>
-            <w:tcBorders>
-              <w:bottom w:val="single" w:sz="8" w:space="0" w:color="auto"/>
-            </w:tcBorders>
-          </w:tcPr>
-          <w:p>
-            <w:pPr>
-              <w:spacing w:line="273" w:lineRule="exact"/>
-              <w:ind w:firstLine="0"/>
-            </w:pPr>
-            <w:bookmarkStart w:id="143" w:name="golfer07"/>
-            <w:bookmarkEnd w:id="142"/>
-          </w:p>
-        </w:tc>
-      </w:tr>
-    </w:tbl>
     <w:p>
       <w:pPr>
         <w:pStyle w:val="af2"/>
         <w:keepLines/>
       </w:pPr>
+      <w:bookmarkStart w:id="143" w:name="golfer07"/>
+      <w:bookmarkEnd w:id="142"/>
       <w:r>
         <w:t>图</w:t>
       </w:r>
@@ -26447,7 +26370,7 @@
         <w:pStyle w:val="af"/>
       </w:pPr>
       <w:bookmarkStart w:id="144" w:name="pgftikz-插图"/>
-      <w:bookmarkStart w:id="145" w:name="_Toc234697895"/>
+      <w:bookmarkStart w:id="145" w:name="_Toc234806272"/>
       <w:bookmarkEnd w:id="129"/>
       <w:bookmarkEnd w:id="137"/>
       <w:r>
@@ -27111,7 +27034,7 @@
         <w:pStyle w:val="af"/>
       </w:pPr>
       <w:bookmarkStart w:id="148" w:name="本章小结-4"/>
-      <w:bookmarkStart w:id="149" w:name="_Toc234697896"/>
+      <w:bookmarkStart w:id="149" w:name="_Toc234806273"/>
       <w:bookmarkEnd w:id="144"/>
       <w:r>
         <w:t xml:space="preserve">5.6 </w:t>
@@ -27155,7 +27078,7 @@
       <w:pPr>
         <w:pStyle w:val="ae"/>
       </w:pPr>
-      <w:bookmarkStart w:id="151" w:name="_Toc234697897"/>
+      <w:bookmarkStart w:id="151" w:name="_Toc234806274"/>
       <w:r>
         <w:lastRenderedPageBreak/>
         <w:t>第</w:t>
@@ -27179,7 +27102,7 @@
         <w:pStyle w:val="af"/>
       </w:pPr>
       <w:bookmarkStart w:id="152" w:name="公式规范"/>
-      <w:bookmarkStart w:id="153" w:name="_Toc234697898"/>
+      <w:bookmarkStart w:id="153" w:name="_Toc234806275"/>
       <w:r>
         <w:t xml:space="preserve">6.1 </w:t>
       </w:r>
@@ -27649,7 +27572,7 @@
         <w:pStyle w:val="af"/>
       </w:pPr>
       <w:bookmarkStart w:id="154" w:name="生成-latex-数学公式的两种方法"/>
-      <w:bookmarkStart w:id="155" w:name="_Toc234697899"/>
+      <w:bookmarkStart w:id="155" w:name="_Toc234806276"/>
       <w:bookmarkEnd w:id="152"/>
       <w:r>
         <w:t xml:space="preserve">6.2 </w:t>
@@ -27775,7 +27698,11 @@
         <w:t> LaTeX </w:t>
       </w:r>
       <w:r>
-        <w:t>编辑器中的文本格式对象，则需要对</w:t>
+        <w:t>编辑器中的文本格式对象，则需要</w:t>
+      </w:r>
+      <w:r>
+        <w:lastRenderedPageBreak/>
+        <w:t>对</w:t>
       </w:r>
       <w:r>
         <w:t> MathType </w:t>
@@ -27806,7 +27733,6 @@
           <w:rPr>
             <w:rFonts w:ascii="Cambria Math" w:hAnsi="Cambria Math"/>
           </w:rPr>
-          <w:lastRenderedPageBreak/>
           <m:t>→</m:t>
         </m:r>
       </m:oMath>
@@ -27893,7 +27819,7 @@
         <w:pStyle w:val="af"/>
       </w:pPr>
       <w:bookmarkStart w:id="156" w:name="行内公式"/>
-      <w:bookmarkStart w:id="157" w:name="_Toc234697900"/>
+      <w:bookmarkStart w:id="157" w:name="_Toc234806277"/>
       <w:bookmarkEnd w:id="154"/>
       <w:r>
         <w:t xml:space="preserve">6.3 </w:t>
@@ -28164,7 +28090,7 @@
         <w:pStyle w:val="af"/>
       </w:pPr>
       <w:bookmarkStart w:id="159" w:name="行间公式"/>
-      <w:bookmarkStart w:id="160" w:name="_Toc234697901"/>
+      <w:bookmarkStart w:id="160" w:name="_Toc234806278"/>
       <w:bookmarkEnd w:id="156"/>
       <w:r>
         <w:t xml:space="preserve">6.4 </w:t>
@@ -28738,6 +28664,7 @@
         <w:pStyle w:val="10"/>
       </w:pPr>
       <w:r>
+        <w:lastRenderedPageBreak/>
         <w:t>另外，在自动编号的某行公式行尾添加标签</w:t>
       </w:r>
       <w:r>
@@ -28752,7 +28679,6 @@
         <w:pStyle w:val="10"/>
       </w:pPr>
       <w:r>
-        <w:lastRenderedPageBreak/>
         <w:t>行间多行公式需采用</w:t>
       </w:r>
       <w:r>
@@ -29075,7 +29001,7 @@
         <w:pStyle w:val="af"/>
       </w:pPr>
       <w:bookmarkStart w:id="162" w:name="可自动调整大小的定界符"/>
-      <w:bookmarkStart w:id="163" w:name="_Toc234697902"/>
+      <w:bookmarkStart w:id="163" w:name="_Toc234806279"/>
       <w:bookmarkEnd w:id="159"/>
       <w:r>
         <w:t xml:space="preserve">6.5 </w:t>
@@ -29553,6 +29479,9 @@
       </w:r>
       <w:r>
         <w:br/>
+      </w:r>
+      <w:r>
+        <w:lastRenderedPageBreak/>
         <w:t xml:space="preserve">    \left(\sum_{k=\frac12}^{N^2}\right)</w:t>
       </w:r>
       <w:r>
@@ -29565,7 +29494,6 @@
         <w:pStyle w:val="10"/>
       </w:pPr>
       <w:r>
-        <w:lastRenderedPageBreak/>
         <w:t>\left </w:t>
       </w:r>
       <w:r>
@@ -29626,7 +29554,7 @@
         <w:pStyle w:val="af"/>
       </w:pPr>
       <w:bookmarkStart w:id="166" w:name="数学重音符号"/>
-      <w:bookmarkStart w:id="167" w:name="_Toc234697903"/>
+      <w:bookmarkStart w:id="167" w:name="_Toc234806280"/>
       <w:bookmarkEnd w:id="162"/>
       <w:r>
         <w:t xml:space="preserve">6.6 </w:t>
@@ -31360,7 +31288,7 @@
         <w:pStyle w:val="af"/>
       </w:pPr>
       <w:bookmarkStart w:id="168" w:name="定理和定义等"/>
-      <w:bookmarkStart w:id="169" w:name="_Toc234697904"/>
+      <w:bookmarkStart w:id="169" w:name="_Toc234806281"/>
       <w:bookmarkEnd w:id="166"/>
       <w:r>
         <w:t xml:space="preserve">6.7 </w:t>
@@ -31376,30 +31304,6 @@
       </w:pPr>
       <w:r>
         <w:t>[Theorem]</w:t>
-      </w:r>
-    </w:p>
-    <w:p>
-      <w:pPr>
-        <w:pStyle w:val="10"/>
-      </w:pPr>
-      <w:r>
-        <w:t>宇宙大爆炸是一种爆炸。</w:t>
-      </w:r>
-    </w:p>
-    <w:p>
-      <w:pPr>
-        <w:pStyle w:val="10"/>
-      </w:pPr>
-      <w:r>
-        <w:t>宇宙大爆炸是一种爆炸。</w:t>
-      </w:r>
-    </w:p>
-    <w:p>
-      <w:pPr>
-        <w:pStyle w:val="10"/>
-      </w:pPr>
-      <w:r>
-        <w:t>宇宙大爆炸是一种爆炸。</w:t>
       </w:r>
     </w:p>
     <w:p>
@@ -31461,10 +31365,34 @@
     </w:p>
     <w:p>
       <w:pPr>
+        <w:pStyle w:val="10"/>
+      </w:pPr>
+      <w:r>
+        <w:t>宇宙大爆炸是一种爆炸。</w:t>
+      </w:r>
+    </w:p>
+    <w:p>
+      <w:pPr>
+        <w:pStyle w:val="10"/>
+      </w:pPr>
+      <w:r>
+        <w:t>宇宙大爆炸是一种爆炸。</w:t>
+      </w:r>
+    </w:p>
+    <w:p>
+      <w:pPr>
+        <w:pStyle w:val="10"/>
+      </w:pPr>
+      <w:r>
+        <w:t>宇宙大爆炸是一种爆炸。</w:t>
+      </w:r>
+    </w:p>
+    <w:p>
+      <w:pPr>
         <w:pStyle w:val="af"/>
       </w:pPr>
       <w:bookmarkStart w:id="170" w:name="公式符号说明"/>
-      <w:bookmarkStart w:id="171" w:name="_Toc234697905"/>
+      <w:bookmarkStart w:id="171" w:name="_Toc234806282"/>
       <w:bookmarkEnd w:id="168"/>
       <w:r>
         <w:t xml:space="preserve">6.8 </w:t>
@@ -31918,7 +31846,7 @@
         <w:pStyle w:val="af"/>
       </w:pPr>
       <w:bookmarkStart w:id="172" w:name="数学公式排版示例"/>
-      <w:bookmarkStart w:id="173" w:name="_Toc234697906"/>
+      <w:bookmarkStart w:id="173" w:name="_Toc234806283"/>
       <w:bookmarkEnd w:id="170"/>
       <w:r>
         <w:t xml:space="preserve">6.9 </w:t>
@@ -31960,6 +31888,7 @@
             <w:rPr>
               <w:rFonts w:ascii="Cambria Math" w:hAnsi="Cambria Math"/>
             </w:rPr>
+            <w:lastRenderedPageBreak/>
             <m:t>f</m:t>
           </m:r>
           <m:r>
@@ -32035,7 +31964,6 @@
         <w:pStyle w:val="ad"/>
       </w:pPr>
       <w:r>
-        <w:lastRenderedPageBreak/>
         <w:t>任给集合</w:t>
       </w:r>
       <w:r>
@@ -33788,7 +33716,7 @@
         <w:pStyle w:val="af"/>
       </w:pPr>
       <w:bookmarkStart w:id="174" w:name="本章小结-5"/>
-      <w:bookmarkStart w:id="175" w:name="_Toc234697907"/>
+      <w:bookmarkStart w:id="175" w:name="_Toc234806284"/>
       <w:bookmarkEnd w:id="172"/>
       <w:r>
         <w:t xml:space="preserve">6.10 </w:t>
@@ -33832,7 +33760,7 @@
       <w:pPr>
         <w:pStyle w:val="ae"/>
       </w:pPr>
-      <w:bookmarkStart w:id="177" w:name="_Toc234697908"/>
+      <w:bookmarkStart w:id="177" w:name="_Toc234806285"/>
       <w:r>
         <w:lastRenderedPageBreak/>
         <w:t>第</w:t>
@@ -33856,7 +33784,7 @@
         <w:pStyle w:val="af"/>
       </w:pPr>
       <w:bookmarkStart w:id="178" w:name="参考文献的引用"/>
-      <w:bookmarkStart w:id="179" w:name="_Toc234697909"/>
+      <w:bookmarkStart w:id="179" w:name="_Toc234806286"/>
       <w:r>
         <w:t xml:space="preserve">7.1 </w:t>
       </w:r>
@@ -35149,7 +35077,7 @@
         <w:pStyle w:val="af"/>
       </w:pPr>
       <w:bookmarkStart w:id="180" w:name="bibtex-文献文件的写法"/>
-      <w:bookmarkStart w:id="181" w:name="_Toc234697910"/>
+      <w:bookmarkStart w:id="181" w:name="_Toc234806287"/>
       <w:bookmarkEnd w:id="178"/>
       <w:r>
         <w:t>7.2 BibTeX </w:t>
@@ -37088,7 +37016,7 @@
         <w:pStyle w:val="af"/>
       </w:pPr>
       <w:bookmarkStart w:id="183" w:name="本章小结-6"/>
-      <w:bookmarkStart w:id="184" w:name="_Toc234697911"/>
+      <w:bookmarkStart w:id="184" w:name="_Toc234806288"/>
       <w:bookmarkEnd w:id="180"/>
       <w:bookmarkEnd w:id="182"/>
       <w:r>
@@ -37133,7 +37061,7 @@
       <w:pPr>
         <w:pStyle w:val="ae"/>
       </w:pPr>
-      <w:bookmarkStart w:id="186" w:name="_Toc234697912"/>
+      <w:bookmarkStart w:id="186" w:name="_Toc234806289"/>
       <w:r>
         <w:lastRenderedPageBreak/>
         <w:t>结论</w:t>
@@ -37228,7 +37156,7 @@
       <w:pPr>
         <w:pStyle w:val="ae"/>
       </w:pPr>
-      <w:bookmarkStart w:id="188" w:name="_Toc234697913"/>
+      <w:bookmarkStart w:id="188" w:name="_Toc234806290"/>
       <w:r>
         <w:lastRenderedPageBreak/>
         <w:t>参考文献</w:t>
@@ -37240,39 +37168,33 @@
         <w:pStyle w:val="af5"/>
         <w:numPr>
           <w:ilvl w:val="0"/>
-          <w:numId w:val="1"/>
+          <w:numId w:val="17"/>
         </w:numPr>
       </w:pPr>
       <w:bookmarkStart w:id="189" w:name="HEU_REF_cnproceed"/>
       <w:r>
-        <w:t>王重阳</w:t>
-      </w:r>
-      <w:r>
-        <w:t xml:space="preserve"> and </w:t>
-      </w:r>
-      <w:r>
-        <w:t>黄药师</w:t>
-      </w:r>
-      <w:r>
-        <w:t xml:space="preserve"> and </w:t>
-      </w:r>
-      <w:r>
-        <w:t>欧阳峰</w:t>
-      </w:r>
-      <w:r>
-        <w:t xml:space="preserve"> and </w:t>
-      </w:r>
-      <w:r>
-        <w:t>洪七公</w:t>
-      </w:r>
-      <w:r>
-        <w:t xml:space="preserve"> and </w:t>
-      </w:r>
-      <w:r>
-        <w:t>段皇帝</w:t>
-      </w:r>
-      <w:r>
-        <w:t>.</w:t>
+        <w:t>王重阳，黄药师，欧阳峰，洪七公，段皇帝</w:t>
+      </w:r>
+      <w:r>
+        <w:t xml:space="preserve">. </w:t>
+      </w:r>
+      <w:r>
+        <w:t>武林高手从入门到精通</w:t>
+      </w:r>
+      <w:r>
+        <w:t xml:space="preserve">. </w:t>
+      </w:r>
+      <w:r>
+        <w:t>第</w:t>
+      </w:r>
+      <w:r>
+        <w:t xml:space="preserve"> N </w:t>
+      </w:r>
+      <w:r>
+        <w:t>次华山论剑</w:t>
+      </w:r>
+      <w:r>
+        <w:t>. 2006.</w:t>
       </w:r>
       <w:bookmarkEnd w:id="189"/>
     </w:p>
@@ -37281,33 +37203,27 @@
         <w:pStyle w:val="af5"/>
         <w:numPr>
           <w:ilvl w:val="0"/>
-          <w:numId w:val="1"/>
+          <w:numId w:val="17"/>
         </w:numPr>
       </w:pPr>
       <w:bookmarkStart w:id="190" w:name="HEU_REF_cnarticle"/>
       <w:r>
-        <w:t>贾宝玉</w:t>
-      </w:r>
-      <w:r>
-        <w:t xml:space="preserve"> and </w:t>
-      </w:r>
-      <w:r>
-        <w:t>林黛玉</w:t>
-      </w:r>
-      <w:r>
-        <w:t xml:space="preserve"> and </w:t>
-      </w:r>
-      <w:r>
-        <w:t>薛宝钗</w:t>
-      </w:r>
-      <w:r>
-        <w:t xml:space="preserve"> and </w:t>
-      </w:r>
-      <w:r>
-        <w:t>贾探春</w:t>
-      </w:r>
-      <w:r>
-        <w:t>.</w:t>
+        <w:t>贾宝玉，林黛玉，薛宝钗，贾探春</w:t>
+      </w:r>
+      <w:r>
+        <w:t xml:space="preserve">. </w:t>
+      </w:r>
+      <w:r>
+        <w:t>论刘姥姥食量大如牛之现实意义</w:t>
+      </w:r>
+      <w:r>
+        <w:t xml:space="preserve">. </w:t>
+      </w:r>
+      <w:r>
+        <w:t>红楼梦杂谈</w:t>
+      </w:r>
+      <w:r>
+        <w:t>. 1800. 260--266.</w:t>
       </w:r>
       <w:bookmarkEnd w:id="190"/>
     </w:p>
@@ -37316,12 +37232,33 @@
         <w:pStyle w:val="af5"/>
         <w:numPr>
           <w:ilvl w:val="0"/>
-          <w:numId w:val="1"/>
+          <w:numId w:val="17"/>
         </w:numPr>
       </w:pPr>
       <w:bookmarkStart w:id="191" w:name="HEU_REF_Lin1992"/>
       <w:r>
-        <w:t>.</w:t>
+        <w:t>林来兴</w:t>
+      </w:r>
+      <w:r>
+        <w:t xml:space="preserve">. </w:t>
+      </w:r>
+      <w:r>
+        <w:t>空间控制技术</w:t>
+      </w:r>
+      <w:r>
+        <w:t xml:space="preserve">. </w:t>
+      </w:r>
+      <w:r>
+        <w:t>北京</w:t>
+      </w:r>
+      <w:r>
+        <w:t xml:space="preserve">: </w:t>
+      </w:r>
+      <w:r>
+        <w:t>宇航出版社</w:t>
+      </w:r>
+      <w:r>
+        <w:t>. 1992. 25-42.</w:t>
       </w:r>
       <w:bookmarkEnd w:id="191"/>
     </w:p>
@@ -37330,12 +37267,33 @@
         <w:pStyle w:val="af5"/>
         <w:numPr>
           <w:ilvl w:val="0"/>
-          <w:numId w:val="1"/>
+          <w:numId w:val="17"/>
         </w:numPr>
       </w:pPr>
       <w:bookmarkStart w:id="192" w:name="HEU_REF_xin1994"/>
       <w:r>
-        <w:t>.</w:t>
+        <w:t>辛希孟，中国科学院文献信息中心，孟广均，信息学</w:t>
+      </w:r>
+      <w:r>
+        <w:t xml:space="preserve">. </w:t>
+      </w:r>
+      <w:r>
+        <w:t>信息技术与信息服务国际研讨会论文集</w:t>
+      </w:r>
+      <w:r>
+        <w:t xml:space="preserve">. </w:t>
+      </w:r>
+      <w:r>
+        <w:t>北京</w:t>
+      </w:r>
+      <w:r>
+        <w:t xml:space="preserve">: </w:t>
+      </w:r>
+      <w:r>
+        <w:t>中国社会科学出版社</w:t>
+      </w:r>
+      <w:r>
+        <w:t>. 1994. 45-49.</w:t>
       </w:r>
       <w:bookmarkEnd w:id="192"/>
     </w:p>
@@ -37344,12 +37302,33 @@
         <w:pStyle w:val="af5"/>
         <w:numPr>
           <w:ilvl w:val="0"/>
-          <w:numId w:val="1"/>
+          <w:numId w:val="17"/>
         </w:numPr>
       </w:pPr>
       <w:bookmarkStart w:id="193" w:name="HEU_REF_zhao1998"/>
       <w:r>
-        <w:t>.</w:t>
+        <w:t>赵耀东</w:t>
+      </w:r>
+      <w:r>
+        <w:t xml:space="preserve">. </w:t>
+      </w:r>
+      <w:r>
+        <w:t>新时代的工业工程师</w:t>
+      </w:r>
+      <w:r>
+        <w:t xml:space="preserve">. </w:t>
+      </w:r>
+      <w:r>
+        <w:t>台北</w:t>
+      </w:r>
+      <w:r>
+        <w:t xml:space="preserve">: </w:t>
+      </w:r>
+      <w:r>
+        <w:t>天下文化出版社</w:t>
+      </w:r>
+      <w:r>
+        <w:t>. 1998.</w:t>
       </w:r>
       <w:bookmarkEnd w:id="193"/>
     </w:p>
@@ -37358,12 +37337,33 @@
         <w:pStyle w:val="af5"/>
         <w:numPr>
           <w:ilvl w:val="0"/>
-          <w:numId w:val="1"/>
+          <w:numId w:val="17"/>
         </w:numPr>
       </w:pPr>
       <w:bookmarkStart w:id="194" w:name="HEU_REF_Chen1992"/>
       <w:r>
-        <w:t>.</w:t>
+        <w:t>谌颖</w:t>
+      </w:r>
+      <w:r>
+        <w:t xml:space="preserve">. </w:t>
+      </w:r>
+      <w:r>
+        <w:t>空间最优交会控制理论与方法研究</w:t>
+      </w:r>
+      <w:r>
+        <w:t xml:space="preserve">. </w:t>
+      </w:r>
+      <w:r>
+        <w:t>哈尔滨</w:t>
+      </w:r>
+      <w:r>
+        <w:t xml:space="preserve">: </w:t>
+      </w:r>
+      <w:r>
+        <w:t>哈尔滨工程大学</w:t>
+      </w:r>
+      <w:r>
+        <w:t>. 1992. 8-13.</w:t>
       </w:r>
       <w:bookmarkEnd w:id="194"/>
     </w:p>
@@ -37372,12 +37372,12 @@
         <w:pStyle w:val="af5"/>
         <w:numPr>
           <w:ilvl w:val="0"/>
-          <w:numId w:val="1"/>
+          <w:numId w:val="17"/>
         </w:numPr>
       </w:pPr>
       <w:bookmarkStart w:id="195" w:name="HEU_REF_heuthesis2017"/>
       <w:r>
-        <w:t>Thesis Template Reference.</w:t>
+        <w:t>Tom John, Xiaoming LI. Thesis Template Reference. Github. 2017. 000-999.</w:t>
       </w:r>
       <w:bookmarkEnd w:id="195"/>
     </w:p>
@@ -37386,15 +37386,33 @@
         <w:pStyle w:val="af5"/>
         <w:numPr>
           <w:ilvl w:val="0"/>
-          <w:numId w:val="1"/>
+          <w:numId w:val="17"/>
         </w:numPr>
       </w:pPr>
       <w:bookmarkStart w:id="196" w:name="HEU_REF_DXM2005"/>
       <w:r>
+        <w:t>邓晓芒，赵林</w:t>
+      </w:r>
+      <w:r>
+        <w:t xml:space="preserve">. </w:t>
+      </w:r>
+      <w:r>
         <w:t>西方哲学史</w:t>
       </w:r>
       <w:r>
-        <w:t>.</w:t>
+        <w:t xml:space="preserve">. </w:t>
+      </w:r>
+      <w:r>
+        <w:t>北京</w:t>
+      </w:r>
+      <w:r>
+        <w:t xml:space="preserve">: </w:t>
+      </w:r>
+      <w:r>
+        <w:t>高等教育出版社</w:t>
+      </w:r>
+      <w:r>
+        <w:t>. 2005.</w:t>
       </w:r>
       <w:bookmarkEnd w:id="196"/>
     </w:p>
@@ -37403,11 +37421,17 @@
         <w:pStyle w:val="af5"/>
         <w:numPr>
           <w:ilvl w:val="0"/>
-          <w:numId w:val="1"/>
+          <w:numId w:val="17"/>
         </w:numPr>
       </w:pPr>
       <w:bookmarkStart w:id="197" w:name="HEU_REF_DXM2000"/>
       <w:r>
+        <w:t>邓晓芒</w:t>
+      </w:r>
+      <w:r>
+        <w:t xml:space="preserve">. </w:t>
+      </w:r>
+      <w:r>
         <w:t>什么是艺术作品的本源</w:t>
       </w:r>
       <w:r>
@@ -37417,7 +37441,13 @@
         <w:t>海德格尔与马克思美学思想的一个比较</w:t>
       </w:r>
       <w:r>
-        <w:t>.</w:t>
+        <w:t xml:space="preserve">. </w:t>
+      </w:r>
+      <w:r>
+        <w:t>哲学研究</w:t>
+      </w:r>
+      <w:r>
+        <w:t>. 2000. 58--64.</w:t>
       </w:r>
       <w:bookmarkEnd w:id="197"/>
     </w:p>
@@ -37426,15 +37456,27 @@
         <w:pStyle w:val="af5"/>
         <w:numPr>
           <w:ilvl w:val="0"/>
-          <w:numId w:val="1"/>
+          <w:numId w:val="17"/>
         </w:numPr>
       </w:pPr>
       <w:bookmarkStart w:id="198" w:name="HEU_REF_LQL1999"/>
       <w:r>
+        <w:t>李秋零</w:t>
+      </w:r>
+      <w:r>
+        <w:t xml:space="preserve">. </w:t>
+      </w:r>
+      <w:r>
         <w:t>康德何以步安瑟尔谟的后尘</w:t>
       </w:r>
       <w:r>
-        <w:t>?.</w:t>
+        <w:t xml:space="preserve">?. </w:t>
+      </w:r>
+      <w:r>
+        <w:t>中国人民大学学报</w:t>
+      </w:r>
+      <w:r>
+        <w:t>. 1999.</w:t>
       </w:r>
       <w:bookmarkEnd w:id="198"/>
     </w:p>
@@ -37443,15 +37485,33 @@
         <w:pStyle w:val="af5"/>
         <w:numPr>
           <w:ilvl w:val="0"/>
-          <w:numId w:val="1"/>
+          <w:numId w:val="17"/>
         </w:numPr>
       </w:pPr>
       <w:bookmarkStart w:id="199" w:name="HEU_REF_FK1981"/>
       <w:r>
+        <w:t>冯康，石钟慈，何政动，赵林</w:t>
+      </w:r>
+      <w:r>
+        <w:t xml:space="preserve">. </w:t>
+      </w:r>
+      <w:r>
         <w:t>弹性结构的数学理论</w:t>
       </w:r>
       <w:r>
-        <w:t>.</w:t>
+        <w:t xml:space="preserve">. </w:t>
+      </w:r>
+      <w:r>
+        <w:t>北京</w:t>
+      </w:r>
+      <w:r>
+        <w:t xml:space="preserve">: </w:t>
+      </w:r>
+      <w:r>
+        <w:t>科学出版社</w:t>
+      </w:r>
+      <w:r>
+        <w:t>. 1981.</w:t>
       </w:r>
       <w:bookmarkEnd w:id="199"/>
     </w:p>
@@ -37460,12 +37520,12 @@
         <w:pStyle w:val="af5"/>
         <w:numPr>
           <w:ilvl w:val="0"/>
-          <w:numId w:val="1"/>
+          <w:numId w:val="17"/>
         </w:numPr>
       </w:pPr>
       <w:bookmarkStart w:id="200" w:name="HEU_REF_braun2007"/>
       <w:r>
-        <w:t>A first course in statistical programming with R.</w:t>
+        <w:t>Braun, J., Murdoch, D.J.. A first course in statistical programming with R. New York, NY, USA: Cambridge University Press Cambridge. 2007.</w:t>
       </w:r>
       <w:bookmarkEnd w:id="200"/>
     </w:p>
@@ -37474,12 +37534,12 @@
         <w:pStyle w:val="af5"/>
         <w:numPr>
           <w:ilvl w:val="0"/>
-          <w:numId w:val="1"/>
+          <w:numId w:val="17"/>
         </w:numPr>
       </w:pPr>
       <w:bookmarkStart w:id="201" w:name="HEU_REF_strawderman2001"/>
       <w:r>
-        <w:t>Strawderman, R.L.</w:t>
+        <w:t>Strawderman, R.L.. Monte Carlo methods in statistical physics. Journal of the American Statistical Association. 2001. 778--778.</w:t>
       </w:r>
       <w:bookmarkEnd w:id="201"/>
     </w:p>
@@ -37488,12 +37548,12 @@
         <w:pStyle w:val="af5"/>
         <w:numPr>
           <w:ilvl w:val="0"/>
-          <w:numId w:val="1"/>
+          <w:numId w:val="17"/>
         </w:numPr>
       </w:pPr>
       <w:bookmarkStart w:id="202" w:name="HEU_REF_kelton2002"/>
       <w:r>
-        <w:t>Simulation with ARENA.</w:t>
+        <w:t>Kelton, W.D., Sadowski, R.P., Sadowski, D.A.. Simulation with ARENA. Linkping, SW: McGraw--Hill Boston, MA. 2002.</w:t>
       </w:r>
       <w:bookmarkEnd w:id="202"/>
     </w:p>
@@ -37502,15 +37562,27 @@
         <w:pStyle w:val="af5"/>
         <w:numPr>
           <w:ilvl w:val="0"/>
-          <w:numId w:val="1"/>
+          <w:numId w:val="17"/>
         </w:numPr>
       </w:pPr>
       <w:bookmarkStart w:id="203" w:name="HEU_REF_OJP1991"/>
       <w:r>
+        <w:t>欧进萍，牛荻涛，杜修力，赵林</w:t>
+      </w:r>
+      <w:r>
+        <w:t xml:space="preserve">. </w:t>
+      </w:r>
+      <w:r>
         <w:t>设计用随机地震动的模型及其参数确定</w:t>
       </w:r>
       <w:r>
-        <w:t>.</w:t>
+        <w:t xml:space="preserve">. </w:t>
+      </w:r>
+      <w:r>
+        <w:t>地震工程与工程振动</w:t>
+      </w:r>
+      <w:r>
+        <w:t>. 1991. 45--53.</w:t>
       </w:r>
       <w:bookmarkEnd w:id="203"/>
     </w:p>
@@ -37519,33 +37591,27 @@
         <w:pStyle w:val="af5"/>
         <w:numPr>
           <w:ilvl w:val="0"/>
-          <w:numId w:val="1"/>
+          <w:numId w:val="17"/>
         </w:numPr>
       </w:pPr>
       <w:bookmarkStart w:id="204" w:name="HEU_REF_OJP1999"/>
       <w:r>
-        <w:t>欧进萍</w:t>
-      </w:r>
-      <w:r>
-        <w:t xml:space="preserve"> and </w:t>
-      </w:r>
-      <w:r>
-        <w:t>何政</w:t>
-      </w:r>
-      <w:r>
-        <w:t xml:space="preserve"> and </w:t>
-      </w:r>
-      <w:r>
-        <w:t>何政动</w:t>
-      </w:r>
-      <w:r>
-        <w:t xml:space="preserve"> and </w:t>
-      </w:r>
-      <w:r>
-        <w:t>赵林</w:t>
-      </w:r>
-      <w:r>
-        <w:t>.</w:t>
+        <w:t>欧进萍，何政，何政动，赵林</w:t>
+      </w:r>
+      <w:r>
+        <w:t xml:space="preserve">. </w:t>
+      </w:r>
+      <w:r>
+        <w:t>钢筋混凝土结构基于地震损伤性能的设计</w:t>
+      </w:r>
+      <w:r>
+        <w:t xml:space="preserve">. </w:t>
+      </w:r>
+      <w:r>
+        <w:t>地震工程与工程振动</w:t>
+      </w:r>
+      <w:r>
+        <w:t>. 1999. 21--30.</w:t>
       </w:r>
       <w:bookmarkEnd w:id="204"/>
     </w:p>
@@ -37554,12 +37620,12 @@
         <w:pStyle w:val="af5"/>
         <w:numPr>
           <w:ilvl w:val="0"/>
-          <w:numId w:val="1"/>
+          <w:numId w:val="17"/>
         </w:numPr>
       </w:pPr>
       <w:bookmarkStart w:id="205" w:name="HEU_REF_MartinVillalba2009"/>
       <w:r>
-        <w:t>Carla Martin-Villalba and Alfonso Urquia and Sebastian Dormido.</w:t>
+        <w:t>Carla Martin-Villalba, Alfonso Urquia, Sebastian Dormido. Visualization and interactive simulation of Modelica models for control education. Guilin, China: IEEE. 2009. 3076--3081.</w:t>
       </w:r>
       <w:bookmarkEnd w:id="205"/>
     </w:p>
@@ -37589,7 +37655,7 @@
       <w:pPr>
         <w:pStyle w:val="ae"/>
       </w:pPr>
-      <w:bookmarkStart w:id="207" w:name="_Toc234697914"/>
+      <w:bookmarkStart w:id="207" w:name="_Toc234806291"/>
       <w:r>
         <w:lastRenderedPageBreak/>
         <w:t>攻读硕士学位期间发表的论文和取得的科研成果</w:t>
@@ -37977,7 +38043,10 @@
         <w:t>一种温热外敷药制备方案：中国，</w:t>
       </w:r>
       <w:r>
-        <w:t>88105607.3[P]. 1989-07-26.</w:t>
+        <w:t>88105607.3[P].</w:t>
+      </w:r>
+      <w:r>
+        <w:t xml:space="preserve"> 1989-07-26.</w:t>
       </w:r>
     </w:p>
     <w:p>
@@ -38089,7 +38158,7 @@
       <w:pPr>
         <w:pStyle w:val="ae"/>
       </w:pPr>
-      <w:bookmarkStart w:id="209" w:name="_Toc234697915"/>
+      <w:bookmarkStart w:id="209" w:name="_Toc234806292"/>
       <w:r>
         <w:lastRenderedPageBreak/>
         <w:t>致谢</w:t>
@@ -41407,7 +41476,7 @@
   <w:abstractNum w:abstractNumId="0" w15:restartNumberingAfterBreak="0">
     <w:nsid w:val="0000A990"/>
     <w:multiLevelType w:val="multilevel"/>
-    <w:tmpl w:val="8E12E12C"/>
+    <w:tmpl w:val="1616C0F0"/>
     <w:lvl w:ilvl="0">
       <w:numFmt w:val="bullet"/>
       <w:lvlText w:val=" "/>
@@ -41484,7 +41553,7 @@
   <w:abstractNum w:abstractNumId="1" w15:restartNumberingAfterBreak="0">
     <w:nsid w:val="0000A991"/>
     <w:multiLevelType w:val="multilevel"/>
-    <w:tmpl w:val="A1FE3C62"/>
+    <w:tmpl w:val="E66E8C4C"/>
     <w:lvl w:ilvl="0">
       <w:numFmt w:val="bullet"/>
       <w:lvlText w:val=""/>
@@ -41588,7 +41657,7 @@
   <w:abstractNum w:abstractNumId="2" w15:restartNumberingAfterBreak="0">
     <w:nsid w:val="00A99201"/>
     <w:multiLevelType w:val="multilevel"/>
-    <w:tmpl w:val="DE9EF9F4"/>
+    <w:tmpl w:val="FC90B57C"/>
     <w:lvl w:ilvl="0">
       <w:start w:val="1"/>
       <w:numFmt w:val="decimal"/>
@@ -41672,9 +41741,9 @@
     </w:lvl>
   </w:abstractNum>
   <w:abstractNum w:abstractNumId="3" w15:restartNumberingAfterBreak="0">
-    <w:nsid w:val="597537A8"/>
+    <w:nsid w:val="3E062ACD"/>
     <w:multiLevelType w:val="singleLevel"/>
-    <w:tmpl w:val="E1308180"/>
+    <w:tmpl w:val="6E902494"/>
     <w:lvl w:ilvl="0">
       <w:start w:val="1"/>
       <w:numFmt w:val="decimal"/>
@@ -41683,7 +41752,217 @@
       <w:lvlJc w:val="left"/>
     </w:lvl>
   </w:abstractNum>
-  <w:num w:numId="1" w16cid:durableId="211960813">
+  <w:num w:numId="1" w16cid:durableId="1643659161">
+    <w:abstractNumId w:val="0"/>
+  </w:num>
+  <w:num w:numId="2" w16cid:durableId="720326540">
+    <w:abstractNumId w:val="1"/>
+  </w:num>
+  <w:num w:numId="3" w16cid:durableId="87624090">
+    <w:abstractNumId w:val="1"/>
+  </w:num>
+  <w:num w:numId="4" w16cid:durableId="2082024909">
+    <w:abstractNumId w:val="1"/>
+  </w:num>
+  <w:num w:numId="5" w16cid:durableId="340746537">
+    <w:abstractNumId w:val="2"/>
+    <w:lvlOverride w:ilvl="0">
+      <w:startOverride w:val="1"/>
+    </w:lvlOverride>
+    <w:lvlOverride w:ilvl="1">
+      <w:startOverride w:val="1"/>
+    </w:lvlOverride>
+    <w:lvlOverride w:ilvl="2">
+      <w:startOverride w:val="1"/>
+    </w:lvlOverride>
+    <w:lvlOverride w:ilvl="3">
+      <w:startOverride w:val="1"/>
+    </w:lvlOverride>
+    <w:lvlOverride w:ilvl="4">
+      <w:startOverride w:val="1"/>
+    </w:lvlOverride>
+    <w:lvlOverride w:ilvl="5">
+      <w:startOverride w:val="1"/>
+    </w:lvlOverride>
+    <w:lvlOverride w:ilvl="6">
+      <w:startOverride w:val="1"/>
+    </w:lvlOverride>
+    <w:lvlOverride w:ilvl="7">
+      <w:startOverride w:val="1"/>
+    </w:lvlOverride>
+    <w:lvlOverride w:ilvl="8">
+      <w:startOverride w:val="1"/>
+    </w:lvlOverride>
+  </w:num>
+  <w:num w:numId="6" w16cid:durableId="1768116535">
+    <w:abstractNumId w:val="2"/>
+    <w:lvlOverride w:ilvl="0">
+      <w:startOverride w:val="1"/>
+    </w:lvlOverride>
+    <w:lvlOverride w:ilvl="1">
+      <w:startOverride w:val="1"/>
+    </w:lvlOverride>
+    <w:lvlOverride w:ilvl="2">
+      <w:startOverride w:val="1"/>
+    </w:lvlOverride>
+    <w:lvlOverride w:ilvl="3">
+      <w:startOverride w:val="1"/>
+    </w:lvlOverride>
+    <w:lvlOverride w:ilvl="4">
+      <w:startOverride w:val="1"/>
+    </w:lvlOverride>
+    <w:lvlOverride w:ilvl="5">
+      <w:startOverride w:val="1"/>
+    </w:lvlOverride>
+    <w:lvlOverride w:ilvl="6">
+      <w:startOverride w:val="1"/>
+    </w:lvlOverride>
+    <w:lvlOverride w:ilvl="7">
+      <w:startOverride w:val="1"/>
+    </w:lvlOverride>
+    <w:lvlOverride w:ilvl="8">
+      <w:startOverride w:val="1"/>
+    </w:lvlOverride>
+  </w:num>
+  <w:num w:numId="7" w16cid:durableId="903442977">
+    <w:abstractNumId w:val="2"/>
+    <w:lvlOverride w:ilvl="0">
+      <w:startOverride w:val="1"/>
+    </w:lvlOverride>
+    <w:lvlOverride w:ilvl="1">
+      <w:startOverride w:val="1"/>
+    </w:lvlOverride>
+    <w:lvlOverride w:ilvl="2">
+      <w:startOverride w:val="1"/>
+    </w:lvlOverride>
+    <w:lvlOverride w:ilvl="3">
+      <w:startOverride w:val="1"/>
+    </w:lvlOverride>
+    <w:lvlOverride w:ilvl="4">
+      <w:startOverride w:val="1"/>
+    </w:lvlOverride>
+    <w:lvlOverride w:ilvl="5">
+      <w:startOverride w:val="1"/>
+    </w:lvlOverride>
+    <w:lvlOverride w:ilvl="6">
+      <w:startOverride w:val="1"/>
+    </w:lvlOverride>
+    <w:lvlOverride w:ilvl="7">
+      <w:startOverride w:val="1"/>
+    </w:lvlOverride>
+    <w:lvlOverride w:ilvl="8">
+      <w:startOverride w:val="1"/>
+    </w:lvlOverride>
+  </w:num>
+  <w:num w:numId="8" w16cid:durableId="1326784668">
+    <w:abstractNumId w:val="1"/>
+  </w:num>
+  <w:num w:numId="9" w16cid:durableId="1071344251">
+    <w:abstractNumId w:val="1"/>
+  </w:num>
+  <w:num w:numId="10" w16cid:durableId="1484349642">
+    <w:abstractNumId w:val="1"/>
+  </w:num>
+  <w:num w:numId="11" w16cid:durableId="1225946459">
+    <w:abstractNumId w:val="2"/>
+    <w:lvlOverride w:ilvl="0">
+      <w:startOverride w:val="1"/>
+    </w:lvlOverride>
+    <w:lvlOverride w:ilvl="1">
+      <w:startOverride w:val="1"/>
+    </w:lvlOverride>
+    <w:lvlOverride w:ilvl="2">
+      <w:startOverride w:val="1"/>
+    </w:lvlOverride>
+    <w:lvlOverride w:ilvl="3">
+      <w:startOverride w:val="1"/>
+    </w:lvlOverride>
+    <w:lvlOverride w:ilvl="4">
+      <w:startOverride w:val="1"/>
+    </w:lvlOverride>
+    <w:lvlOverride w:ilvl="5">
+      <w:startOverride w:val="1"/>
+    </w:lvlOverride>
+    <w:lvlOverride w:ilvl="6">
+      <w:startOverride w:val="1"/>
+    </w:lvlOverride>
+    <w:lvlOverride w:ilvl="7">
+      <w:startOverride w:val="1"/>
+    </w:lvlOverride>
+    <w:lvlOverride w:ilvl="8">
+      <w:startOverride w:val="1"/>
+    </w:lvlOverride>
+  </w:num>
+  <w:num w:numId="12" w16cid:durableId="230237765">
+    <w:abstractNumId w:val="2"/>
+    <w:lvlOverride w:ilvl="0">
+      <w:startOverride w:val="1"/>
+    </w:lvlOverride>
+    <w:lvlOverride w:ilvl="1">
+      <w:startOverride w:val="1"/>
+    </w:lvlOverride>
+    <w:lvlOverride w:ilvl="2">
+      <w:startOverride w:val="1"/>
+    </w:lvlOverride>
+    <w:lvlOverride w:ilvl="3">
+      <w:startOverride w:val="1"/>
+    </w:lvlOverride>
+    <w:lvlOverride w:ilvl="4">
+      <w:startOverride w:val="1"/>
+    </w:lvlOverride>
+    <w:lvlOverride w:ilvl="5">
+      <w:startOverride w:val="1"/>
+    </w:lvlOverride>
+    <w:lvlOverride w:ilvl="6">
+      <w:startOverride w:val="1"/>
+    </w:lvlOverride>
+    <w:lvlOverride w:ilvl="7">
+      <w:startOverride w:val="1"/>
+    </w:lvlOverride>
+    <w:lvlOverride w:ilvl="8">
+      <w:startOverride w:val="1"/>
+    </w:lvlOverride>
+  </w:num>
+  <w:num w:numId="13" w16cid:durableId="13970057">
+    <w:abstractNumId w:val="2"/>
+    <w:lvlOverride w:ilvl="0">
+      <w:startOverride w:val="1"/>
+    </w:lvlOverride>
+    <w:lvlOverride w:ilvl="1">
+      <w:startOverride w:val="1"/>
+    </w:lvlOverride>
+    <w:lvlOverride w:ilvl="2">
+      <w:startOverride w:val="1"/>
+    </w:lvlOverride>
+    <w:lvlOverride w:ilvl="3">
+      <w:startOverride w:val="1"/>
+    </w:lvlOverride>
+    <w:lvlOverride w:ilvl="4">
+      <w:startOverride w:val="1"/>
+    </w:lvlOverride>
+    <w:lvlOverride w:ilvl="5">
+      <w:startOverride w:val="1"/>
+    </w:lvlOverride>
+    <w:lvlOverride w:ilvl="6">
+      <w:startOverride w:val="1"/>
+    </w:lvlOverride>
+    <w:lvlOverride w:ilvl="7">
+      <w:startOverride w:val="1"/>
+    </w:lvlOverride>
+    <w:lvlOverride w:ilvl="8">
+      <w:startOverride w:val="1"/>
+    </w:lvlOverride>
+  </w:num>
+  <w:num w:numId="14" w16cid:durableId="957106854">
+    <w:abstractNumId w:val="1"/>
+  </w:num>
+  <w:num w:numId="15" w16cid:durableId="544029255">
+    <w:abstractNumId w:val="1"/>
+  </w:num>
+  <w:num w:numId="16" w16cid:durableId="717554051">
+    <w:abstractNumId w:val="1"/>
+  </w:num>
+  <w:num w:numId="17" w16cid:durableId="1562519172">
     <w:abstractNumId w:val="3"/>
   </w:num>
 </w:numbering>
@@ -42340,6 +42619,17 @@
       <w:color w:val="0F4761" w:themeColor="accent1" w:themeShade="BF"/>
     </w:rPr>
   </w:style>
+  <w:style w:type="table" w:customStyle="1" w:styleId="FigureTable">
+    <w:name w:val="FigureTable"/>
+    <w:tblPr>
+      <w:tblCellMar>
+        <w:top w:w="0" w:type="dxa"/>
+        <w:left w:w="0" w:type="dxa"/>
+        <w:bottom w:w="0" w:type="dxa"/>
+        <w:right w:w="0" w:type="dxa"/>
+      </w:tblCellMar>
+    </w:tblPr>
+  </w:style>
   <w:style w:type="paragraph" w:customStyle="1" w:styleId="10">
     <w:name w:val="正文1"/>
     <w:basedOn w:val="a"/>
@@ -42351,9 +42641,6 @@
     <w:basedOn w:val="10"/>
     <w:uiPriority w:val="11"/>
     <w:qFormat/>
-    <w:pPr>
-      <w:spacing w:line="240" w:lineRule="auto"/>
-    </w:pPr>
   </w:style>
   <w:style w:type="paragraph" w:customStyle="1" w:styleId="ae">
     <w:name w:val="章标题"/>

</xml_diff>